<commit_message>
Updated CONOPS and added resume
</commit_message>
<xml_diff>
--- a/docs/srDesign_CONOPS.docx
+++ b/docs/srDesign_CONOPS.docx
@@ -30,7 +30,7 @@
                     <pic:cNvPicPr/>
                   </pic:nvPicPr>
                   <pic:blipFill>
-                    <a:blip r:embed="rId7">
+                    <a:blip r:embed="rId9">
                       <a:extLst>
                         <a:ext uri="{28A0092B-C50C-407E-A947-70E740481C1C}">
                           <a14:useLocalDpi xmlns:a14="http://schemas.microsoft.com/office/drawing/2010/main" val="0"/>
@@ -890,7 +890,7 @@
           <w:r>
             <w:fldChar w:fldCharType="separate"/>
           </w:r>
-          <w:hyperlink w:anchor="_Toc336947266" w:history="1">
+          <w:hyperlink w:anchor="_Toc342144232" w:history="1">
             <w:r>
               <w:rPr>
                 <w:rStyle w:val="Hyperlink"/>
@@ -917,7 +917,7 @@
                 <w:noProof/>
                 <w:webHidden/>
               </w:rPr>
-              <w:instrText xml:space="preserve"> PAGEREF _Toc336947266 \h </w:instrText>
+              <w:instrText xml:space="preserve"> PAGEREF _Toc342144232 \h </w:instrText>
             </w:r>
             <w:r>
               <w:rPr>
@@ -956,7 +956,7 @@
               <w:noProof/>
             </w:rPr>
           </w:pPr>
-          <w:hyperlink w:anchor="_Toc336947267" w:history="1">
+          <w:hyperlink w:anchor="_Toc342144233" w:history="1">
             <w:r>
               <w:rPr>
                 <w:rStyle w:val="Hyperlink"/>
@@ -997,7 +997,7 @@
                 <w:noProof/>
                 <w:webHidden/>
               </w:rPr>
-              <w:instrText xml:space="preserve"> PAGEREF _Toc336947267 \h </w:instrText>
+              <w:instrText xml:space="preserve"> PAGEREF _Toc342144233 \h </w:instrText>
             </w:r>
             <w:r>
               <w:rPr>
@@ -1036,7 +1036,7 @@
               <w:noProof/>
             </w:rPr>
           </w:pPr>
-          <w:hyperlink w:anchor="_Toc336947268" w:history="1">
+          <w:hyperlink w:anchor="_Toc342144234" w:history="1">
             <w:r>
               <w:rPr>
                 <w:rStyle w:val="Hyperlink"/>
@@ -1077,7 +1077,7 @@
                 <w:noProof/>
                 <w:webHidden/>
               </w:rPr>
-              <w:instrText xml:space="preserve"> PAGEREF _Toc336947268 \h </w:instrText>
+              <w:instrText xml:space="preserve"> PAGEREF _Toc342144234 \h </w:instrText>
             </w:r>
             <w:r>
               <w:rPr>
@@ -1116,7 +1116,7 @@
               <w:noProof/>
             </w:rPr>
           </w:pPr>
-          <w:hyperlink w:anchor="_Toc336947270" w:history="1">
+          <w:hyperlink w:anchor="_Toc342144236" w:history="1">
             <w:r>
               <w:rPr>
                 <w:rStyle w:val="Hyperlink"/>
@@ -1157,7 +1157,7 @@
                 <w:noProof/>
                 <w:webHidden/>
               </w:rPr>
-              <w:instrText xml:space="preserve"> PAGEREF _Toc336947270 \h </w:instrText>
+              <w:instrText xml:space="preserve"> PAGEREF _Toc342144236 \h </w:instrText>
             </w:r>
             <w:r>
               <w:rPr>
@@ -1196,7 +1196,7 @@
               <w:noProof/>
             </w:rPr>
           </w:pPr>
-          <w:hyperlink w:anchor="_Toc336947271" w:history="1">
+          <w:hyperlink w:anchor="_Toc342144237" w:history="1">
             <w:r>
               <w:rPr>
                 <w:rStyle w:val="Hyperlink"/>
@@ -1237,7 +1237,7 @@
                 <w:noProof/>
                 <w:webHidden/>
               </w:rPr>
-              <w:instrText xml:space="preserve"> PAGEREF _Toc336947271 \h </w:instrText>
+              <w:instrText xml:space="preserve"> PAGEREF _Toc342144237 \h </w:instrText>
             </w:r>
             <w:r>
               <w:rPr>
@@ -1276,7 +1276,7 @@
               <w:noProof/>
             </w:rPr>
           </w:pPr>
-          <w:hyperlink w:anchor="_Toc336947272" w:history="1">
+          <w:hyperlink w:anchor="_Toc342144238" w:history="1">
             <w:r>
               <w:rPr>
                 <w:rStyle w:val="Hyperlink"/>
@@ -1317,7 +1317,7 @@
                 <w:noProof/>
                 <w:webHidden/>
               </w:rPr>
-              <w:instrText xml:space="preserve"> PAGEREF _Toc336947272 \h </w:instrText>
+              <w:instrText xml:space="preserve"> PAGEREF _Toc342144238 \h </w:instrText>
             </w:r>
             <w:r>
               <w:rPr>
@@ -1356,7 +1356,7 @@
               <w:noProof/>
             </w:rPr>
           </w:pPr>
-          <w:hyperlink w:anchor="_Toc336947273" w:history="1">
+          <w:hyperlink w:anchor="_Toc342144239" w:history="1">
             <w:r>
               <w:rPr>
                 <w:rStyle w:val="Hyperlink"/>
@@ -1397,7 +1397,7 @@
                 <w:noProof/>
                 <w:webHidden/>
               </w:rPr>
-              <w:instrText xml:space="preserve"> PAGEREF _Toc336947273 \h </w:instrText>
+              <w:instrText xml:space="preserve"> PAGEREF _Toc342144239 \h </w:instrText>
             </w:r>
             <w:r>
               <w:rPr>
@@ -1440,7 +1440,7 @@
               <w:noProof/>
             </w:rPr>
           </w:pPr>
-          <w:hyperlink w:anchor="_Toc336947279" w:history="1">
+          <w:hyperlink w:anchor="_Toc342144245" w:history="1">
             <w:r>
               <w:rPr>
                 <w:rStyle w:val="Hyperlink"/>
@@ -1460,7 +1460,7 @@
                 <w:rStyle w:val="Hyperlink"/>
                 <w:noProof/>
               </w:rPr>
-              <w:t>User of Games</w:t>
+              <w:t>Subscribers</w:t>
             </w:r>
             <w:r>
               <w:rPr>
@@ -1481,7 +1481,7 @@
                 <w:noProof/>
                 <w:webHidden/>
               </w:rPr>
-              <w:instrText xml:space="preserve"> PAGEREF _Toc336947279 \h </w:instrText>
+              <w:instrText xml:space="preserve"> PAGEREF _Toc342144245 \h </w:instrText>
             </w:r>
             <w:r>
               <w:rPr>
@@ -1520,7 +1520,7 @@
               <w:noProof/>
             </w:rPr>
           </w:pPr>
-          <w:hyperlink w:anchor="_Toc336947280" w:history="1">
+          <w:hyperlink w:anchor="_Toc342144246" w:history="1">
             <w:r>
               <w:rPr>
                 <w:rStyle w:val="Hyperlink"/>
@@ -1561,7 +1561,7 @@
                 <w:noProof/>
                 <w:webHidden/>
               </w:rPr>
-              <w:instrText xml:space="preserve"> PAGEREF _Toc336947280 \h </w:instrText>
+              <w:instrText xml:space="preserve"> PAGEREF _Toc342144246 \h </w:instrText>
             </w:r>
             <w:r>
               <w:rPr>
@@ -1582,6 +1582,174 @@
                 <w:webHidden/>
               </w:rPr>
               <w:t>11</w:t>
+            </w:r>
+            <w:r>
+              <w:rPr>
+                <w:noProof/>
+                <w:webHidden/>
+              </w:rPr>
+              <w:fldChar w:fldCharType="end"/>
+            </w:r>
+          </w:hyperlink>
+        </w:p>
+        <w:p>
+          <w:pPr>
+            <w:pStyle w:val="TOC2"/>
+            <w:tabs>
+              <w:tab w:val="left" w:pos="880"/>
+              <w:tab w:val="right" w:leader="dot" w:pos="9350"/>
+            </w:tabs>
+            <w:rPr>
+              <w:rFonts w:eastAsiaTheme="minorEastAsia"/>
+              <w:noProof/>
+            </w:rPr>
+          </w:pPr>
+          <w:hyperlink w:anchor="_Toc342144248" w:history="1">
+            <w:r>
+              <w:rPr>
+                <w:rStyle w:val="Hyperlink"/>
+                <w:noProof/>
+              </w:rPr>
+              <w:t>7.1</w:t>
+            </w:r>
+            <w:r>
+              <w:rPr>
+                <w:rFonts w:eastAsiaTheme="minorEastAsia"/>
+                <w:noProof/>
+              </w:rPr>
+              <w:tab/>
+            </w:r>
+            <w:r>
+              <w:rPr>
+                <w:rStyle w:val="Hyperlink"/>
+                <w:noProof/>
+              </w:rPr>
+              <w:t>Client</w:t>
+            </w:r>
+            <w:r>
+              <w:rPr>
+                <w:noProof/>
+                <w:webHidden/>
+              </w:rPr>
+              <w:tab/>
+            </w:r>
+            <w:r>
+              <w:rPr>
+                <w:noProof/>
+                <w:webHidden/>
+              </w:rPr>
+              <w:fldChar w:fldCharType="begin"/>
+            </w:r>
+            <w:r>
+              <w:rPr>
+                <w:noProof/>
+                <w:webHidden/>
+              </w:rPr>
+              <w:instrText xml:space="preserve"> PAGEREF _Toc342144248 \h </w:instrText>
+            </w:r>
+            <w:r>
+              <w:rPr>
+                <w:noProof/>
+                <w:webHidden/>
+              </w:rPr>
+            </w:r>
+            <w:r>
+              <w:rPr>
+                <w:noProof/>
+                <w:webHidden/>
+              </w:rPr>
+              <w:fldChar w:fldCharType="separate"/>
+            </w:r>
+            <w:r>
+              <w:rPr>
+                <w:noProof/>
+                <w:webHidden/>
+              </w:rPr>
+              <w:t>11</w:t>
+            </w:r>
+            <w:r>
+              <w:rPr>
+                <w:noProof/>
+                <w:webHidden/>
+              </w:rPr>
+              <w:fldChar w:fldCharType="end"/>
+            </w:r>
+          </w:hyperlink>
+        </w:p>
+        <w:p>
+          <w:pPr>
+            <w:pStyle w:val="TOC2"/>
+            <w:tabs>
+              <w:tab w:val="left" w:pos="880"/>
+              <w:tab w:val="right" w:leader="dot" w:pos="9350"/>
+            </w:tabs>
+            <w:rPr>
+              <w:rFonts w:eastAsiaTheme="minorEastAsia"/>
+              <w:noProof/>
+            </w:rPr>
+          </w:pPr>
+          <w:hyperlink w:anchor="_Toc342144249" w:history="1">
+            <w:r>
+              <w:rPr>
+                <w:rStyle w:val="Hyperlink"/>
+                <w:noProof/>
+              </w:rPr>
+              <w:t>7.2</w:t>
+            </w:r>
+            <w:r>
+              <w:rPr>
+                <w:rFonts w:eastAsiaTheme="minorEastAsia"/>
+                <w:noProof/>
+              </w:rPr>
+              <w:tab/>
+            </w:r>
+            <w:r>
+              <w:rPr>
+                <w:rStyle w:val="Hyperlink"/>
+                <w:noProof/>
+              </w:rPr>
+              <w:t>Subscriber</w:t>
+            </w:r>
+            <w:r>
+              <w:rPr>
+                <w:noProof/>
+                <w:webHidden/>
+              </w:rPr>
+              <w:tab/>
+            </w:r>
+            <w:r>
+              <w:rPr>
+                <w:noProof/>
+                <w:webHidden/>
+              </w:rPr>
+              <w:fldChar w:fldCharType="begin"/>
+            </w:r>
+            <w:r>
+              <w:rPr>
+                <w:noProof/>
+                <w:webHidden/>
+              </w:rPr>
+              <w:instrText xml:space="preserve"> PAGEREF _Toc342144249 \h </w:instrText>
+            </w:r>
+            <w:r>
+              <w:rPr>
+                <w:noProof/>
+                <w:webHidden/>
+              </w:rPr>
+            </w:r>
+            <w:r>
+              <w:rPr>
+                <w:noProof/>
+                <w:webHidden/>
+              </w:rPr>
+              <w:fldChar w:fldCharType="separate"/>
+            </w:r>
+            <w:r>
+              <w:rPr>
+                <w:noProof/>
+                <w:webHidden/>
+              </w:rPr>
+              <w:t>12</w:t>
             </w:r>
             <w:r>
               <w:rPr>
@@ -1620,7 +1788,7 @@
           <w:noProof/>
         </w:rPr>
       </w:pPr>
-      <w:bookmarkStart w:id="0" w:name="_Toc336947266"/>
+      <w:bookmarkStart w:id="0" w:name="_Toc342144232"/>
       <w:r>
         <w:t>Table of Figures</w:t>
       </w:r>
@@ -2192,7 +2360,7 @@
           <w:numId w:val="5"/>
         </w:numPr>
       </w:pPr>
-      <w:bookmarkStart w:id="1" w:name="_Toc336947267"/>
+      <w:bookmarkStart w:id="1" w:name="_Toc342144233"/>
       <w:r>
         <w:t>Scope</w:t>
       </w:r>
@@ -2224,7 +2392,12 @@
         <w:t>t</w:t>
       </w:r>
       <w:r>
-        <w:t>ly under development by team Plugged In</w:t>
+        <w:t>ly under development by tea</w:t>
+      </w:r>
+      <w:bookmarkStart w:id="2" w:name="_GoBack"/>
+      <w:bookmarkEnd w:id="2"/>
+      <w:r>
+        <w:t>m Plugged In</w:t>
       </w:r>
       <w:r>
         <w:t xml:space="preserve"> as a Senior Design Project, under the direction of Brian Butterfield and David Springhetti of Innovative Systems L.L.C.</w:t>
@@ -2241,11 +2414,11 @@
           <w:numId w:val="5"/>
         </w:numPr>
       </w:pPr>
-      <w:bookmarkStart w:id="2" w:name="_Toc336947268"/>
+      <w:bookmarkStart w:id="3" w:name="_Toc342144234"/>
       <w:r>
         <w:t>Reference Documents</w:t>
       </w:r>
-      <w:bookmarkEnd w:id="2"/>
+      <w:bookmarkEnd w:id="3"/>
     </w:p>
     <w:p>
       <w:pPr>
@@ -2269,10 +2442,14 @@
           <w:szCs w:val="28"/>
         </w:rPr>
       </w:pPr>
-      <w:bookmarkStart w:id="3" w:name="_Toc336940821"/>
-      <w:bookmarkStart w:id="4" w:name="_Toc336947269"/>
-      <w:bookmarkEnd w:id="3"/>
+      <w:bookmarkStart w:id="4" w:name="_Toc336940821"/>
+      <w:bookmarkStart w:id="5" w:name="_Toc336947269"/>
+      <w:bookmarkStart w:id="6" w:name="_Toc342144217"/>
+      <w:bookmarkStart w:id="7" w:name="_Toc342144235"/>
       <w:bookmarkEnd w:id="4"/>
+      <w:bookmarkEnd w:id="5"/>
+      <w:bookmarkEnd w:id="6"/>
+      <w:bookmarkEnd w:id="7"/>
     </w:p>
     <w:p>
       <w:r>
@@ -2290,12 +2467,12 @@
           <w:numId w:val="5"/>
         </w:numPr>
       </w:pPr>
-      <w:bookmarkStart w:id="5" w:name="_Toc336947270"/>
+      <w:bookmarkStart w:id="8" w:name="_Toc342144236"/>
       <w:r>
         <w:lastRenderedPageBreak/>
         <w:t>Current System</w:t>
       </w:r>
-      <w:bookmarkEnd w:id="5"/>
+      <w:bookmarkEnd w:id="8"/>
     </w:p>
     <w:p>
       <w:pPr>
@@ -2342,10 +2519,21 @@
         </w:numPr>
       </w:pPr>
       <w:r>
-        <w:t xml:space="preserve">The games will run on Amino Set Top Boxes. These STBs run a custom build of QT, binded to C++. </w:t>
-      </w:r>
-      <w:r>
-        <w:t>The game server software will be written in C# and must be able to run under .NET 4.5. The server should be able to operate in a Windows or Azure operating system.</w:t>
+        <w:t xml:space="preserve">The games will run on Amino Set Top Boxes. These STBs run a custom build of QT, </w:t>
+      </w:r>
+      <w:proofErr w:type="spellStart"/>
+      <w:r>
+        <w:t>binded</w:t>
+      </w:r>
+      <w:proofErr w:type="spellEnd"/>
+      <w:r>
+        <w:t xml:space="preserve"> to C++. </w:t>
+      </w:r>
+      <w:r>
+        <w:t xml:space="preserve">The game server software will be written in C# and must be able to run under .NET 4.5. The server should be able to operate in a Windows </w:t>
+      </w:r>
+      <w:r>
+        <w:t>server operating system or Azure cloud solution.</w:t>
       </w:r>
       <w:r>
         <w:t xml:space="preserve"> </w:t>
@@ -2435,8 +2623,13 @@
         </w:numPr>
       </w:pPr>
       <w:r>
-        <w:t xml:space="preserve"> One or more APMaxes</w:t>
-      </w:r>
+        <w:t xml:space="preserve"> One or more </w:t>
+      </w:r>
+      <w:proofErr w:type="spellStart"/>
+      <w:r>
+        <w:t>APMaxes</w:t>
+      </w:r>
+      <w:proofErr w:type="spellEnd"/>
     </w:p>
     <w:p>
       <w:pPr>
@@ -2495,7 +2688,13 @@
         <w:t xml:space="preserve">The multi-player game environment will be spread cross country and distributed over many systems already in place. </w:t>
       </w:r>
       <w:r>
-        <w:t xml:space="preserve">The environment follows the client-server model with an added element in the middle, the APMax, known as middleware. </w:t>
+        <w:t xml:space="preserve">The environment follows the client-server model with an added </w:t>
+      </w:r>
+      <w:r>
+        <w:t>middleware element, the APMax.</w:t>
+      </w:r>
+      <w:r>
+        <w:t xml:space="preserve"> </w:t>
       </w:r>
     </w:p>
     <w:p>
@@ -2506,11 +2705,11 @@
           <w:numId w:val="5"/>
         </w:numPr>
       </w:pPr>
-      <w:bookmarkStart w:id="6" w:name="_Toc336947271"/>
+      <w:bookmarkStart w:id="9" w:name="_Toc342144237"/>
       <w:r>
         <w:t>Justification and nature of proposed changes</w:t>
       </w:r>
-      <w:bookmarkEnd w:id="6"/>
+      <w:bookmarkEnd w:id="9"/>
     </w:p>
     <w:p>
       <w:pPr>
@@ -2535,23 +2734,22 @@
         <w:rPr>
           <w:sz w:val="23"/>
           <w:szCs w:val="23"/>
-          <w:highlight w:val="yellow"/>
-        </w:rPr>
-        <w:t>Copy and pasted from Kiosk team</w:t>
+        </w:rPr>
+        <w:t xml:space="preserve">Team Changes – Any changes to the requirements by team </w:t>
       </w:r>
       <w:r>
         <w:rPr>
           <w:sz w:val="23"/>
           <w:szCs w:val="23"/>
         </w:rPr>
-        <w:t xml:space="preserve"> </w:t>
+        <w:t>Plugged In</w:t>
       </w:r>
       <w:r>
         <w:rPr>
           <w:sz w:val="23"/>
           <w:szCs w:val="23"/>
         </w:rPr>
-        <w:t>Team Changes – Any changes to the requirements by team KDM must be approved by the project sponsor, Innovative Systems L</w:t>
+        <w:t xml:space="preserve"> must be approved by the project sponsor, Innovative Systems L</w:t>
       </w:r>
       <w:r>
         <w:rPr>
@@ -2652,11 +2850,11 @@
           <w:numId w:val="5"/>
         </w:numPr>
       </w:pPr>
-      <w:bookmarkStart w:id="7" w:name="_Toc336947272"/>
+      <w:bookmarkStart w:id="10" w:name="_Toc342144238"/>
       <w:r>
         <w:t>Deliverables</w:t>
       </w:r>
-      <w:bookmarkEnd w:id="7"/>
+      <w:bookmarkEnd w:id="10"/>
     </w:p>
     <w:p>
       <w:pPr>
@@ -2703,7 +2901,22 @@
         </w:numPr>
       </w:pPr>
       <w:r>
-        <w:t xml:space="preserve">Several games as a proof of concept </w:t>
+        <w:t>Chess</w:t>
+      </w:r>
+      <w:r>
+        <w:t xml:space="preserve"> games as a proof of concept </w:t>
+      </w:r>
+    </w:p>
+    <w:p>
+      <w:pPr>
+        <w:pStyle w:val="ListParagraph"/>
+        <w:numPr>
+          <w:ilvl w:val="1"/>
+          <w:numId w:val="5"/>
+        </w:numPr>
+      </w:pPr>
+      <w:r>
+        <w:t>Virtual APMax code</w:t>
       </w:r>
     </w:p>
     <w:p>
@@ -2714,12 +2927,12 @@
           <w:numId w:val="5"/>
         </w:numPr>
       </w:pPr>
-      <w:bookmarkStart w:id="8" w:name="_Toc336947273"/>
+      <w:bookmarkStart w:id="11" w:name="_Toc342144239"/>
       <w:r>
         <w:lastRenderedPageBreak/>
         <w:t>Analysis of Proposed System</w:t>
       </w:r>
-      <w:bookmarkEnd w:id="8"/>
+      <w:bookmarkEnd w:id="11"/>
     </w:p>
     <w:p>
       <w:pPr>
@@ -2743,10 +2956,14 @@
           <w:szCs w:val="28"/>
         </w:rPr>
       </w:pPr>
-      <w:bookmarkStart w:id="9" w:name="_Toc336940826"/>
-      <w:bookmarkStart w:id="10" w:name="_Toc336947274"/>
-      <w:bookmarkEnd w:id="9"/>
-      <w:bookmarkEnd w:id="10"/>
+      <w:bookmarkStart w:id="12" w:name="_Toc336940826"/>
+      <w:bookmarkStart w:id="13" w:name="_Toc336947274"/>
+      <w:bookmarkStart w:id="14" w:name="_Toc342144222"/>
+      <w:bookmarkStart w:id="15" w:name="_Toc342144240"/>
+      <w:bookmarkEnd w:id="12"/>
+      <w:bookmarkEnd w:id="13"/>
+      <w:bookmarkEnd w:id="14"/>
+      <w:bookmarkEnd w:id="15"/>
     </w:p>
     <w:p>
       <w:pPr>
@@ -2770,8 +2987,12 @@
           <w:szCs w:val="28"/>
         </w:rPr>
       </w:pPr>
-      <w:bookmarkStart w:id="11" w:name="_Toc336947275"/>
-      <w:bookmarkEnd w:id="11"/>
+      <w:bookmarkStart w:id="16" w:name="_Toc336947275"/>
+      <w:bookmarkStart w:id="17" w:name="_Toc342144223"/>
+      <w:bookmarkStart w:id="18" w:name="_Toc342144241"/>
+      <w:bookmarkEnd w:id="16"/>
+      <w:bookmarkEnd w:id="17"/>
+      <w:bookmarkEnd w:id="18"/>
     </w:p>
     <w:p>
       <w:pPr>
@@ -2795,8 +3016,12 @@
           <w:szCs w:val="28"/>
         </w:rPr>
       </w:pPr>
-      <w:bookmarkStart w:id="12" w:name="_Toc336947276"/>
-      <w:bookmarkEnd w:id="12"/>
+      <w:bookmarkStart w:id="19" w:name="_Toc336947276"/>
+      <w:bookmarkStart w:id="20" w:name="_Toc342144224"/>
+      <w:bookmarkStart w:id="21" w:name="_Toc342144242"/>
+      <w:bookmarkEnd w:id="19"/>
+      <w:bookmarkEnd w:id="20"/>
+      <w:bookmarkEnd w:id="21"/>
     </w:p>
     <w:p>
       <w:pPr>
@@ -2820,8 +3045,12 @@
           <w:szCs w:val="28"/>
         </w:rPr>
       </w:pPr>
-      <w:bookmarkStart w:id="13" w:name="_Toc336947277"/>
-      <w:bookmarkEnd w:id="13"/>
+      <w:bookmarkStart w:id="22" w:name="_Toc336947277"/>
+      <w:bookmarkStart w:id="23" w:name="_Toc342144225"/>
+      <w:bookmarkStart w:id="24" w:name="_Toc342144243"/>
+      <w:bookmarkEnd w:id="22"/>
+      <w:bookmarkEnd w:id="23"/>
+      <w:bookmarkEnd w:id="24"/>
     </w:p>
     <w:p>
       <w:pPr>
@@ -2845,18 +3074,22 @@
           <w:szCs w:val="28"/>
         </w:rPr>
       </w:pPr>
-      <w:bookmarkStart w:id="14" w:name="_Toc336947278"/>
-      <w:bookmarkEnd w:id="14"/>
+      <w:bookmarkStart w:id="25" w:name="_Toc336947278"/>
+      <w:bookmarkStart w:id="26" w:name="_Toc342144226"/>
+      <w:bookmarkStart w:id="27" w:name="_Toc342144244"/>
+      <w:bookmarkEnd w:id="25"/>
+      <w:bookmarkEnd w:id="26"/>
+      <w:bookmarkEnd w:id="27"/>
     </w:p>
     <w:p>
       <w:pPr>
         <w:pStyle w:val="Heading2"/>
       </w:pPr>
+      <w:bookmarkStart w:id="28" w:name="_Toc342144245"/>
       <w:r>
         <w:t>Subscribers</w:t>
       </w:r>
-      <w:bookmarkStart w:id="15" w:name="_GoBack"/>
-      <w:bookmarkEnd w:id="15"/>
+      <w:bookmarkEnd w:id="28"/>
     </w:p>
     <w:p>
       <w:pPr>
@@ -2882,202 +3115,6 @@
                 <pic:pic xmlns:pic="http://schemas.openxmlformats.org/drawingml/2006/picture">
                   <pic:nvPicPr>
                     <pic:cNvPr id="0" name="Picture 2" descr="C:\Users\Davidj\Documents\GitHub\STBMF\CONOPS\photo 7.JPG"/>
-                    <pic:cNvPicPr>
-                      <a:picLocks noChangeAspect="1" noChangeArrowheads="1"/>
-                    </pic:cNvPicPr>
-                  </pic:nvPicPr>
-                  <pic:blipFill>
-                    <a:blip r:embed="rId8">
-                      <a:extLst>
-                        <a:ext uri="{28A0092B-C50C-407E-A947-70E740481C1C}">
-                          <a14:useLocalDpi xmlns:a14="http://schemas.microsoft.com/office/drawing/2010/main" val="0"/>
-                        </a:ext>
-                      </a:extLst>
-                    </a:blip>
-                    <a:srcRect/>
-                    <a:stretch>
-                      <a:fillRect/>
-                    </a:stretch>
-                  </pic:blipFill>
-                  <pic:spPr bwMode="auto">
-                    <a:xfrm>
-                      <a:off x="0" y="0"/>
-                      <a:ext cx="5943600" cy="4438650"/>
-                    </a:xfrm>
-                    <a:prstGeom prst="rect">
-                      <a:avLst/>
-                    </a:prstGeom>
-                    <a:noFill/>
-                    <a:ln>
-                      <a:noFill/>
-                    </a:ln>
-                  </pic:spPr>
-                </pic:pic>
-              </a:graphicData>
-            </a:graphic>
-          </wp:inline>
-        </w:drawing>
-      </w:r>
-    </w:p>
-    <w:p>
-      <w:pPr>
-        <w:pStyle w:val="Caption"/>
-      </w:pPr>
-      <w:bookmarkStart w:id="16" w:name="_Toc336940745"/>
-      <w:r>
-        <w:t xml:space="preserve">Figure </w:t>
-      </w:r>
-      <w:r>
-        <w:fldChar w:fldCharType="begin"/>
-      </w:r>
-      <w:r>
-        <w:instrText xml:space="preserve"> SEQ Figure \* ARABIC </w:instrText>
-      </w:r>
-      <w:r>
-        <w:fldChar w:fldCharType="separate"/>
-      </w:r>
-      <w:r>
-        <w:rPr>
-          <w:noProof/>
-        </w:rPr>
-        <w:t>1</w:t>
-      </w:r>
-      <w:r>
-        <w:rPr>
-          <w:noProof/>
-        </w:rPr>
-        <w:fldChar w:fldCharType="end"/>
-      </w:r>
-      <w:r>
-        <w:t xml:space="preserve"> - Main Menu</w:t>
-      </w:r>
-      <w:bookmarkEnd w:id="16"/>
-    </w:p>
-    <w:p>
-      <w:r>
-        <w:t xml:space="preserve">If a user decides to play a game while using their STB, they will pull up the main menu by pressing the Menu button on their remote control. Now, they will see an option called “My Apps”, and when scrolled over, a submenu will appear that shows Games. </w:t>
-      </w:r>
-    </w:p>
-    <w:p>
-      <w:pPr>
-        <w:keepNext/>
-      </w:pPr>
-      <w:r>
-        <w:rPr>
-          <w:noProof/>
-        </w:rPr>
-        <w:lastRenderedPageBreak/>
-        <w:drawing>
-          <wp:inline distT="0" distB="0" distL="0" distR="0" wp14:anchorId="10875EB2" wp14:editId="34489EB8">
-            <wp:extent cx="5943600" cy="4438650"/>
-            <wp:effectExtent l="0" t="0" r="0" b="0"/>
-            <wp:docPr id="4" name="Picture 4" descr="C:\Users\Davidj\Documents\GitHub\STBMF\CONOPS\photo 10.JPG"/>
-            <wp:cNvGraphicFramePr>
-              <a:graphicFrameLocks xmlns:a="http://schemas.openxmlformats.org/drawingml/2006/main" noChangeAspect="1"/>
-            </wp:cNvGraphicFramePr>
-            <a:graphic xmlns:a="http://schemas.openxmlformats.org/drawingml/2006/main">
-              <a:graphicData uri="http://schemas.openxmlformats.org/drawingml/2006/picture">
-                <pic:pic xmlns:pic="http://schemas.openxmlformats.org/drawingml/2006/picture">
-                  <pic:nvPicPr>
-                    <pic:cNvPr id="0" name="Picture 3" descr="C:\Users\Davidj\Documents\GitHub\STBMF\CONOPS\photo 10.JPG"/>
-                    <pic:cNvPicPr>
-                      <a:picLocks noChangeAspect="1" noChangeArrowheads="1"/>
-                    </pic:cNvPicPr>
-                  </pic:nvPicPr>
-                  <pic:blipFill>
-                    <a:blip r:embed="rId9">
-                      <a:extLst>
-                        <a:ext uri="{28A0092B-C50C-407E-A947-70E740481C1C}">
-                          <a14:useLocalDpi xmlns:a14="http://schemas.microsoft.com/office/drawing/2010/main" val="0"/>
-                        </a:ext>
-                      </a:extLst>
-                    </a:blip>
-                    <a:srcRect/>
-                    <a:stretch>
-                      <a:fillRect/>
-                    </a:stretch>
-                  </pic:blipFill>
-                  <pic:spPr bwMode="auto">
-                    <a:xfrm>
-                      <a:off x="0" y="0"/>
-                      <a:ext cx="5943600" cy="4438650"/>
-                    </a:xfrm>
-                    <a:prstGeom prst="rect">
-                      <a:avLst/>
-                    </a:prstGeom>
-                    <a:noFill/>
-                    <a:ln>
-                      <a:noFill/>
-                    </a:ln>
-                  </pic:spPr>
-                </pic:pic>
-              </a:graphicData>
-            </a:graphic>
-          </wp:inline>
-        </w:drawing>
-      </w:r>
-    </w:p>
-    <w:p>
-      <w:pPr>
-        <w:pStyle w:val="Caption"/>
-      </w:pPr>
-      <w:bookmarkStart w:id="17" w:name="_Toc336940746"/>
-      <w:r>
-        <w:t xml:space="preserve">Figure </w:t>
-      </w:r>
-      <w:r>
-        <w:fldChar w:fldCharType="begin"/>
-      </w:r>
-      <w:r>
-        <w:instrText xml:space="preserve"> SEQ Figure \* ARABIC </w:instrText>
-      </w:r>
-      <w:r>
-        <w:fldChar w:fldCharType="separate"/>
-      </w:r>
-      <w:r>
-        <w:rPr>
-          <w:noProof/>
-        </w:rPr>
-        <w:t>2</w:t>
-      </w:r>
-      <w:r>
-        <w:rPr>
-          <w:noProof/>
-        </w:rPr>
-        <w:fldChar w:fldCharType="end"/>
-      </w:r>
-      <w:r>
-        <w:t>- Apps submenu</w:t>
-      </w:r>
-      <w:bookmarkEnd w:id="17"/>
-    </w:p>
-    <w:p>
-      <w:r>
-        <w:t xml:space="preserve">Once the user scrolls over to the Apps submenu, they will be able to choose the Games App by pressing OK. </w:t>
-      </w:r>
-    </w:p>
-    <w:p>
-      <w:pPr>
-        <w:keepNext/>
-      </w:pPr>
-      <w:r>
-        <w:rPr>
-          <w:noProof/>
-        </w:rPr>
-        <w:lastRenderedPageBreak/>
-        <w:drawing>
-          <wp:inline distT="0" distB="0" distL="0" distR="0" wp14:anchorId="29144D15" wp14:editId="0ADDE1D8">
-            <wp:extent cx="5943600" cy="4438650"/>
-            <wp:effectExtent l="0" t="0" r="0" b="0"/>
-            <wp:docPr id="5" name="Picture 5" descr="C:\Users\Davidj\Documents\GitHub\STBMF\CONOPS\photo 11.JPG"/>
-            <wp:cNvGraphicFramePr>
-              <a:graphicFrameLocks xmlns:a="http://schemas.openxmlformats.org/drawingml/2006/main" noChangeAspect="1"/>
-            </wp:cNvGraphicFramePr>
-            <a:graphic xmlns:a="http://schemas.openxmlformats.org/drawingml/2006/main">
-              <a:graphicData uri="http://schemas.openxmlformats.org/drawingml/2006/picture">
-                <pic:pic xmlns:pic="http://schemas.openxmlformats.org/drawingml/2006/picture">
-                  <pic:nvPicPr>
-                    <pic:cNvPr id="0" name="Picture 4" descr="C:\Users\Davidj\Documents\GitHub\STBMF\CONOPS\photo 11.JPG"/>
                     <pic:cNvPicPr>
                       <a:picLocks noChangeAspect="1" noChangeArrowheads="1"/>
                     </pic:cNvPicPr>
@@ -3119,42 +3156,26 @@
       <w:pPr>
         <w:pStyle w:val="Caption"/>
       </w:pPr>
-      <w:bookmarkStart w:id="18" w:name="_Toc336940747"/>
+      <w:bookmarkStart w:id="29" w:name="_Toc336940745"/>
       <w:r>
         <w:t xml:space="preserve">Figure </w:t>
       </w:r>
-      <w:r>
-        <w:fldChar w:fldCharType="begin"/>
-      </w:r>
-      <w:r>
-        <w:instrText xml:space="preserve"> SEQ Figure \* ARABIC </w:instrText>
-      </w:r>
-      <w:r>
-        <w:fldChar w:fldCharType="separate"/>
-      </w:r>
-      <w:r>
-        <w:rPr>
-          <w:noProof/>
-        </w:rPr>
-        <w:t>3</w:t>
-      </w:r>
-      <w:r>
-        <w:rPr>
-          <w:noProof/>
-        </w:rPr>
-        <w:fldChar w:fldCharType="end"/>
-      </w:r>
-      <w:r>
-        <w:t>- Games submenu</w:t>
-      </w:r>
-      <w:bookmarkEnd w:id="18"/>
-    </w:p>
-    <w:p>
-      <w:r>
-        <w:t xml:space="preserve">Now that the user has entered the Games submenu, a list of games will appear. Here, there is only one game currently available, but each time this menu is entered, a new list will be retrieved from the server, so when there are more games available, the user will be able to see them. </w:t>
-      </w:r>
-      <w:r>
-        <w:t>Now that Tile Puzzle is selected, if the user hits OK on their remote, the game will be downloaded and started.</w:t>
+      <w:fldSimple w:instr=" SEQ Figure \* ARABIC ">
+        <w:r>
+          <w:rPr>
+            <w:noProof/>
+          </w:rPr>
+          <w:t>1</w:t>
+        </w:r>
+      </w:fldSimple>
+      <w:r>
+        <w:t xml:space="preserve"> - Main Menu</w:t>
+      </w:r>
+      <w:bookmarkEnd w:id="29"/>
+    </w:p>
+    <w:p>
+      <w:r>
+        <w:t xml:space="preserve">If a user decides to play a game while using their STB, they will pull up the main menu by pressing the Menu button on their remote control. Now, they will see an option called “My Apps”, and when scrolled over, a submenu will appear that shows Games. </w:t>
       </w:r>
     </w:p>
     <w:p>
@@ -3167,10 +3188,10 @@
         </w:rPr>
         <w:lastRenderedPageBreak/>
         <w:drawing>
-          <wp:inline distT="0" distB="0" distL="0" distR="0" wp14:anchorId="7F13FEC7" wp14:editId="3D22029E">
+          <wp:inline distT="0" distB="0" distL="0" distR="0" wp14:anchorId="10875EB2" wp14:editId="34489EB8">
             <wp:extent cx="5943600" cy="4438650"/>
             <wp:effectExtent l="0" t="0" r="0" b="0"/>
-            <wp:docPr id="6" name="Picture 6" descr="C:\Users\Davidj\Documents\GitHub\STBMF\CONOPS\photo 6.JPG"/>
+            <wp:docPr id="4" name="Picture 4" descr="C:\Users\Davidj\Documents\GitHub\STBMF\CONOPS\photo 10.JPG"/>
             <wp:cNvGraphicFramePr>
               <a:graphicFrameLocks xmlns:a="http://schemas.openxmlformats.org/drawingml/2006/main" noChangeAspect="1"/>
             </wp:cNvGraphicFramePr>
@@ -3178,13 +3199,13 @@
               <a:graphicData uri="http://schemas.openxmlformats.org/drawingml/2006/picture">
                 <pic:pic xmlns:pic="http://schemas.openxmlformats.org/drawingml/2006/picture">
                   <pic:nvPicPr>
-                    <pic:cNvPr id="0" name="Picture 5" descr="C:\Users\Davidj\Documents\GitHub\STBMF\CONOPS\photo 6.JPG"/>
+                    <pic:cNvPr id="0" name="Picture 3" descr="C:\Users\Davidj\Documents\GitHub\STBMF\CONOPS\photo 10.JPG"/>
                     <pic:cNvPicPr>
                       <a:picLocks noChangeAspect="1" noChangeArrowheads="1"/>
                     </pic:cNvPicPr>
                   </pic:nvPicPr>
                   <pic:blipFill>
-                    <a:blip r:embed="rId11" cstate="print">
+                    <a:blip r:embed="rId11">
                       <a:extLst>
                         <a:ext uri="{28A0092B-C50C-407E-A947-70E740481C1C}">
                           <a14:useLocalDpi xmlns:a14="http://schemas.microsoft.com/office/drawing/2010/main" val="0"/>
@@ -3220,39 +3241,26 @@
       <w:pPr>
         <w:pStyle w:val="Caption"/>
       </w:pPr>
-      <w:bookmarkStart w:id="19" w:name="_Toc336940748"/>
+      <w:bookmarkStart w:id="30" w:name="_Toc336940746"/>
       <w:r>
         <w:t xml:space="preserve">Figure </w:t>
       </w:r>
-      <w:r>
-        <w:fldChar w:fldCharType="begin"/>
-      </w:r>
-      <w:r>
-        <w:instrText xml:space="preserve"> SEQ Figure \* ARABIC </w:instrText>
-      </w:r>
-      <w:r>
-        <w:fldChar w:fldCharType="separate"/>
-      </w:r>
-      <w:r>
-        <w:rPr>
-          <w:noProof/>
-        </w:rPr>
-        <w:t>4</w:t>
-      </w:r>
-      <w:r>
-        <w:rPr>
-          <w:noProof/>
-        </w:rPr>
-        <w:fldChar w:fldCharType="end"/>
-      </w:r>
-      <w:r>
-        <w:t xml:space="preserve"> - New Tile Puzzle Game</w:t>
-      </w:r>
-      <w:bookmarkEnd w:id="19"/>
-    </w:p>
-    <w:p>
-      <w:r>
-        <w:t>For all games, there will be a menu on the left, as shown above, with a set of static base commands. Here, we can start a new game, change settings, view statistics, or exit the game. If the user hits the Info button on their remote control, a help screen will also appear. Each game can add options to this menu, but cannot remove these base options.</w:t>
+      <w:fldSimple w:instr=" SEQ Figure \* ARABIC ">
+        <w:r>
+          <w:rPr>
+            <w:noProof/>
+          </w:rPr>
+          <w:t>2</w:t>
+        </w:r>
+      </w:fldSimple>
+      <w:r>
+        <w:t>- Apps submenu</w:t>
+      </w:r>
+      <w:bookmarkEnd w:id="30"/>
+    </w:p>
+    <w:p>
+      <w:r>
+        <w:t xml:space="preserve">Once the user scrolls over to the Apps submenu, they will be able to choose the Games App by pressing OK. </w:t>
       </w:r>
     </w:p>
     <w:p>
@@ -3265,10 +3273,10 @@
         </w:rPr>
         <w:lastRenderedPageBreak/>
         <w:drawing>
-          <wp:inline distT="0" distB="0" distL="0" distR="0" wp14:anchorId="7B5DAD1C" wp14:editId="53C70707">
+          <wp:inline distT="0" distB="0" distL="0" distR="0" wp14:anchorId="29144D15" wp14:editId="0ADDE1D8">
             <wp:extent cx="5943600" cy="4438650"/>
             <wp:effectExtent l="0" t="0" r="0" b="0"/>
-            <wp:docPr id="7" name="Picture 7" descr="C:\Users\Davidj\Documents\GitHub\STBMF\CONOPS\photo 3.JPG"/>
+            <wp:docPr id="5" name="Picture 5" descr="C:\Users\Davidj\Documents\GitHub\STBMF\CONOPS\photo 11.JPG"/>
             <wp:cNvGraphicFramePr>
               <a:graphicFrameLocks xmlns:a="http://schemas.openxmlformats.org/drawingml/2006/main" noChangeAspect="1"/>
             </wp:cNvGraphicFramePr>
@@ -3276,13 +3284,13 @@
               <a:graphicData uri="http://schemas.openxmlformats.org/drawingml/2006/picture">
                 <pic:pic xmlns:pic="http://schemas.openxmlformats.org/drawingml/2006/picture">
                   <pic:nvPicPr>
-                    <pic:cNvPr id="0" name="Picture 6" descr="C:\Users\Davidj\Documents\GitHub\STBMF\CONOPS\photo 3.JPG"/>
+                    <pic:cNvPr id="0" name="Picture 4" descr="C:\Users\Davidj\Documents\GitHub\STBMF\CONOPS\photo 11.JPG"/>
                     <pic:cNvPicPr>
                       <a:picLocks noChangeAspect="1" noChangeArrowheads="1"/>
                     </pic:cNvPicPr>
                   </pic:nvPicPr>
                   <pic:blipFill>
-                    <a:blip r:embed="rId12" cstate="print">
+                    <a:blip r:embed="rId12">
                       <a:extLst>
                         <a:ext uri="{28A0092B-C50C-407E-A947-70E740481C1C}">
                           <a14:useLocalDpi xmlns:a14="http://schemas.microsoft.com/office/drawing/2010/main" val="0"/>
@@ -3318,57 +3326,29 @@
       <w:pPr>
         <w:pStyle w:val="Caption"/>
       </w:pPr>
-      <w:bookmarkStart w:id="20" w:name="_Toc336940749"/>
+      <w:bookmarkStart w:id="31" w:name="_Toc336940747"/>
       <w:r>
         <w:t xml:space="preserve">Figure </w:t>
       </w:r>
-      <w:r>
-        <w:fldChar w:fldCharType="begin"/>
-      </w:r>
-      <w:r>
-        <w:instrText xml:space="preserve"> SEQ Figure \* ARABIC </w:instrText>
-      </w:r>
-      <w:r>
-        <w:fldChar w:fldCharType="separate"/>
-      </w:r>
-      <w:r>
-        <w:rPr>
-          <w:noProof/>
-        </w:rPr>
-        <w:t>5</w:t>
-      </w:r>
-      <w:r>
-        <w:rPr>
-          <w:noProof/>
-        </w:rPr>
-        <w:fldChar w:fldCharType="end"/>
-      </w:r>
-      <w:r>
-        <w:t xml:space="preserve"> - Settings Popover</w:t>
-      </w:r>
-      <w:bookmarkEnd w:id="20"/>
-    </w:p>
-    <w:p>
-      <w:r>
-        <w:t>When</w:t>
-      </w:r>
-      <w:r>
-        <w:t xml:space="preserve"> the</w:t>
-      </w:r>
-      <w:r>
-        <w:t xml:space="preserve"> </w:t>
-      </w:r>
-      <w:r>
-        <w:t>settings option is</w:t>
-      </w:r>
-      <w:r>
-        <w:t xml:space="preserve"> pressed, a simple popover is brought up so the user can change personal prefer</w:t>
-      </w:r>
-      <w:r>
-        <w:t xml:space="preserve">ences, </w:t>
-      </w:r>
-      <w:r>
-        <w:t>difficulties, levels, etc. Here, when the user is done, they can either hit OK to save changes or Cancel to discard the changes and resume play.</w:t>
+      <w:fldSimple w:instr=" SEQ Figure \* ARABIC ">
+        <w:r>
+          <w:rPr>
+            <w:noProof/>
+          </w:rPr>
+          <w:t>3</w:t>
+        </w:r>
+      </w:fldSimple>
+      <w:r>
+        <w:t>- Games submenu</w:t>
+      </w:r>
+      <w:bookmarkEnd w:id="31"/>
+    </w:p>
+    <w:p>
+      <w:r>
+        <w:t xml:space="preserve">Now that the user has entered the Games submenu, a list of games will appear. Here, there is only one game currently available, but each time this menu is entered, a new list will be retrieved from the server, so when there are more games available, the user will be able to see them. </w:t>
+      </w:r>
+      <w:r>
+        <w:t>Now that Tile Puzzle is selected, if the user hits OK on their remote, the game will be downloaded and started.</w:t>
       </w:r>
     </w:p>
     <w:p>
@@ -3381,10 +3361,10 @@
         </w:rPr>
         <w:lastRenderedPageBreak/>
         <w:drawing>
-          <wp:inline distT="0" distB="0" distL="0" distR="0" wp14:anchorId="3F7D076F" wp14:editId="3A92F328">
+          <wp:inline distT="0" distB="0" distL="0" distR="0" wp14:anchorId="7F13FEC7" wp14:editId="3D22029E">
             <wp:extent cx="5943600" cy="4438650"/>
             <wp:effectExtent l="0" t="0" r="0" b="0"/>
-            <wp:docPr id="8" name="Picture 8" descr="C:\Users\Davidj\Documents\GitHub\STBMF\CONOPS\photo 4.JPG"/>
+            <wp:docPr id="6" name="Picture 6" descr="C:\Users\Davidj\Documents\GitHub\STBMF\CONOPS\photo 6.JPG"/>
             <wp:cNvGraphicFramePr>
               <a:graphicFrameLocks xmlns:a="http://schemas.openxmlformats.org/drawingml/2006/main" noChangeAspect="1"/>
             </wp:cNvGraphicFramePr>
@@ -3392,7 +3372,7 @@
               <a:graphicData uri="http://schemas.openxmlformats.org/drawingml/2006/picture">
                 <pic:pic xmlns:pic="http://schemas.openxmlformats.org/drawingml/2006/picture">
                   <pic:nvPicPr>
-                    <pic:cNvPr id="0" name="Picture 7" descr="C:\Users\Davidj\Documents\GitHub\STBMF\CONOPS\photo 4.JPG"/>
+                    <pic:cNvPr id="0" name="Picture 5" descr="C:\Users\Davidj\Documents\GitHub\STBMF\CONOPS\photo 6.JPG"/>
                     <pic:cNvPicPr>
                       <a:picLocks noChangeAspect="1" noChangeArrowheads="1"/>
                     </pic:cNvPicPr>
@@ -3434,39 +3414,26 @@
       <w:pPr>
         <w:pStyle w:val="Caption"/>
       </w:pPr>
-      <w:bookmarkStart w:id="21" w:name="_Toc336940750"/>
+      <w:bookmarkStart w:id="32" w:name="_Toc336940748"/>
       <w:r>
         <w:t xml:space="preserve">Figure </w:t>
       </w:r>
-      <w:r>
-        <w:fldChar w:fldCharType="begin"/>
-      </w:r>
-      <w:r>
-        <w:instrText xml:space="preserve"> SEQ Figure \* ARABIC </w:instrText>
-      </w:r>
-      <w:r>
-        <w:fldChar w:fldCharType="separate"/>
-      </w:r>
-      <w:r>
-        <w:rPr>
-          <w:noProof/>
-        </w:rPr>
-        <w:t>6</w:t>
-      </w:r>
-      <w:r>
-        <w:rPr>
-          <w:noProof/>
-        </w:rPr>
-        <w:fldChar w:fldCharType="end"/>
-      </w:r>
-      <w:r>
-        <w:t xml:space="preserve"> - Statistics Popover</w:t>
-      </w:r>
-      <w:bookmarkEnd w:id="21"/>
-    </w:p>
-    <w:p>
-      <w:r>
-        <w:t>If the user wants to see their statistics of a game, they can bring up the statistics popover and view different stats that cover the lifetime of the game, or since the last reset. When the user is done, they can either select the Ok option or hit Exit on their remote. If a user feels the need to reset the statistics, they can also do this by selecting the Reset option.</w:t>
+      <w:fldSimple w:instr=" SEQ Figure \* ARABIC ">
+        <w:r>
+          <w:rPr>
+            <w:noProof/>
+          </w:rPr>
+          <w:t>4</w:t>
+        </w:r>
+      </w:fldSimple>
+      <w:r>
+        <w:t xml:space="preserve"> - New Tile Puzzle Game</w:t>
+      </w:r>
+      <w:bookmarkEnd w:id="32"/>
+    </w:p>
+    <w:p>
+      <w:r>
+        <w:t>For all games, there will be a menu on the left, as shown above, with a set of static base commands. Here, we can start a new game, change settings, view statistics, or exit the game. If the user hits the Info button on their remote control, a help screen will also appear. Each game can add options to this menu, but cannot remove these base options.</w:t>
       </w:r>
     </w:p>
     <w:p>
@@ -3479,10 +3446,10 @@
         </w:rPr>
         <w:lastRenderedPageBreak/>
         <w:drawing>
-          <wp:inline distT="0" distB="0" distL="0" distR="0" wp14:anchorId="1318BD16" wp14:editId="371AB56E">
+          <wp:inline distT="0" distB="0" distL="0" distR="0" wp14:anchorId="7B5DAD1C" wp14:editId="53C70707">
             <wp:extent cx="5943600" cy="4438650"/>
             <wp:effectExtent l="0" t="0" r="0" b="0"/>
-            <wp:docPr id="9" name="Picture 9" descr="C:\Users\Davidj\Documents\GitHub\STBMF\CONOPS\photo 2.JPG"/>
+            <wp:docPr id="7" name="Picture 7" descr="C:\Users\Davidj\Documents\GitHub\STBMF\CONOPS\photo 3.JPG"/>
             <wp:cNvGraphicFramePr>
               <a:graphicFrameLocks xmlns:a="http://schemas.openxmlformats.org/drawingml/2006/main" noChangeAspect="1"/>
             </wp:cNvGraphicFramePr>
@@ -3490,7 +3457,7 @@
               <a:graphicData uri="http://schemas.openxmlformats.org/drawingml/2006/picture">
                 <pic:pic xmlns:pic="http://schemas.openxmlformats.org/drawingml/2006/picture">
                   <pic:nvPicPr>
-                    <pic:cNvPr id="0" name="Picture 8" descr="C:\Users\Davidj\Documents\GitHub\STBMF\CONOPS\photo 2.JPG"/>
+                    <pic:cNvPr id="0" name="Picture 6" descr="C:\Users\Davidj\Documents\GitHub\STBMF\CONOPS\photo 3.JPG"/>
                     <pic:cNvPicPr>
                       <a:picLocks noChangeAspect="1" noChangeArrowheads="1"/>
                     </pic:cNvPicPr>
@@ -3532,42 +3499,44 @@
       <w:pPr>
         <w:pStyle w:val="Caption"/>
       </w:pPr>
-      <w:bookmarkStart w:id="22" w:name="_Toc336940751"/>
+      <w:bookmarkStart w:id="33" w:name="_Toc336940749"/>
       <w:r>
         <w:t xml:space="preserve">Figure </w:t>
       </w:r>
-      <w:r>
-        <w:fldChar w:fldCharType="begin"/>
-      </w:r>
-      <w:r>
-        <w:instrText xml:space="preserve"> SEQ Figure \* ARABIC </w:instrText>
-      </w:r>
-      <w:r>
-        <w:fldChar w:fldCharType="separate"/>
-      </w:r>
-      <w:r>
-        <w:rPr>
-          <w:noProof/>
-        </w:rPr>
-        <w:t>7</w:t>
-      </w:r>
-      <w:r>
-        <w:rPr>
-          <w:noProof/>
-        </w:rPr>
-        <w:fldChar w:fldCharType="end"/>
-      </w:r>
-      <w:r>
-        <w:t xml:space="preserve"> - Help Popover</w:t>
-      </w:r>
-      <w:bookmarkEnd w:id="22"/>
-    </w:p>
-    <w:p>
-      <w:r>
-        <w:t xml:space="preserve">At any time during gameplay, the user can hit the Info button their remote and bring up the Help popover. </w:t>
-      </w:r>
-      <w:r>
-        <w:t>When the user is done reading and wants to return to the game, any button press will exit the popover.</w:t>
+      <w:fldSimple w:instr=" SEQ Figure \* ARABIC ">
+        <w:r>
+          <w:rPr>
+            <w:noProof/>
+          </w:rPr>
+          <w:t>5</w:t>
+        </w:r>
+      </w:fldSimple>
+      <w:r>
+        <w:t xml:space="preserve"> - Settings Popover</w:t>
+      </w:r>
+      <w:bookmarkEnd w:id="33"/>
+    </w:p>
+    <w:p>
+      <w:r>
+        <w:t>When</w:t>
+      </w:r>
+      <w:r>
+        <w:t xml:space="preserve"> the</w:t>
+      </w:r>
+      <w:r>
+        <w:t xml:space="preserve"> </w:t>
+      </w:r>
+      <w:r>
+        <w:t>settings option is</w:t>
+      </w:r>
+      <w:r>
+        <w:t xml:space="preserve"> pressed, a simple popover is brought up so the user can change personal prefer</w:t>
+      </w:r>
+      <w:r>
+        <w:t xml:space="preserve">ences, </w:t>
+      </w:r>
+      <w:r>
+        <w:t>difficulties, levels, etc. Here, when the user is done, they can either hit OK to save changes or Cancel to discard the changes and resume play.</w:t>
       </w:r>
     </w:p>
     <w:p>
@@ -3580,10 +3549,10 @@
         </w:rPr>
         <w:lastRenderedPageBreak/>
         <w:drawing>
-          <wp:inline distT="0" distB="0" distL="0" distR="0" wp14:anchorId="4C488E32" wp14:editId="1683EC5C">
+          <wp:inline distT="0" distB="0" distL="0" distR="0" wp14:anchorId="3F7D076F" wp14:editId="3A92F328">
             <wp:extent cx="5943600" cy="4438650"/>
             <wp:effectExtent l="0" t="0" r="0" b="0"/>
-            <wp:docPr id="10" name="Picture 10" descr="C:\Users\Davidj\Documents\GitHub\STBMF\CONOPS\photo 5.JPG"/>
+            <wp:docPr id="8" name="Picture 8" descr="C:\Users\Davidj\Documents\GitHub\STBMF\CONOPS\photo 4.JPG"/>
             <wp:cNvGraphicFramePr>
               <a:graphicFrameLocks xmlns:a="http://schemas.openxmlformats.org/drawingml/2006/main" noChangeAspect="1"/>
             </wp:cNvGraphicFramePr>
@@ -3591,7 +3560,7 @@
               <a:graphicData uri="http://schemas.openxmlformats.org/drawingml/2006/picture">
                 <pic:pic xmlns:pic="http://schemas.openxmlformats.org/drawingml/2006/picture">
                   <pic:nvPicPr>
-                    <pic:cNvPr id="0" name="Picture 9" descr="C:\Users\Davidj\Documents\GitHub\STBMF\CONOPS\photo 5.JPG"/>
+                    <pic:cNvPr id="0" name="Picture 7" descr="C:\Users\Davidj\Documents\GitHub\STBMF\CONOPS\photo 4.JPG"/>
                     <pic:cNvPicPr>
                       <a:picLocks noChangeAspect="1" noChangeArrowheads="1"/>
                     </pic:cNvPicPr>
@@ -3633,35 +3602,195 @@
       <w:pPr>
         <w:pStyle w:val="Caption"/>
       </w:pPr>
-      <w:bookmarkStart w:id="23" w:name="_Toc336940752"/>
+      <w:bookmarkStart w:id="34" w:name="_Toc336940750"/>
       <w:r>
         <w:t xml:space="preserve">Figure </w:t>
       </w:r>
-      <w:r>
-        <w:fldChar w:fldCharType="begin"/>
-      </w:r>
-      <w:r>
-        <w:instrText xml:space="preserve"> SEQ Figure \* ARABIC </w:instrText>
-      </w:r>
-      <w:r>
-        <w:fldChar w:fldCharType="separate"/>
-      </w:r>
+      <w:fldSimple w:instr=" SEQ Figure \* ARABIC ">
+        <w:r>
+          <w:rPr>
+            <w:noProof/>
+          </w:rPr>
+          <w:t>6</w:t>
+        </w:r>
+      </w:fldSimple>
+      <w:r>
+        <w:t xml:space="preserve"> - Statistics Popover</w:t>
+      </w:r>
+      <w:bookmarkEnd w:id="34"/>
+    </w:p>
+    <w:p>
+      <w:r>
+        <w:t>If the user wants to see their statistics of a game, they can bring up the statistics popover and view different stats that cover the lifetime of the game, or since the last reset. When the user is done, they can either select the Ok option or hit Exit on their remote. If a user feels the need to reset the statistics, they can also do this by selecting the Reset option.</w:t>
+      </w:r>
+    </w:p>
+    <w:p>
+      <w:pPr>
+        <w:keepNext/>
+      </w:pPr>
       <w:r>
         <w:rPr>
           <w:noProof/>
         </w:rPr>
-        <w:t>8</w:t>
-      </w:r>
+        <w:lastRenderedPageBreak/>
+        <w:drawing>
+          <wp:inline distT="0" distB="0" distL="0" distR="0" wp14:anchorId="1318BD16" wp14:editId="371AB56E">
+            <wp:extent cx="5943600" cy="4438650"/>
+            <wp:effectExtent l="0" t="0" r="0" b="0"/>
+            <wp:docPr id="9" name="Picture 9" descr="C:\Users\Davidj\Documents\GitHub\STBMF\CONOPS\photo 2.JPG"/>
+            <wp:cNvGraphicFramePr>
+              <a:graphicFrameLocks xmlns:a="http://schemas.openxmlformats.org/drawingml/2006/main" noChangeAspect="1"/>
+            </wp:cNvGraphicFramePr>
+            <a:graphic xmlns:a="http://schemas.openxmlformats.org/drawingml/2006/main">
+              <a:graphicData uri="http://schemas.openxmlformats.org/drawingml/2006/picture">
+                <pic:pic xmlns:pic="http://schemas.openxmlformats.org/drawingml/2006/picture">
+                  <pic:nvPicPr>
+                    <pic:cNvPr id="0" name="Picture 8" descr="C:\Users\Davidj\Documents\GitHub\STBMF\CONOPS\photo 2.JPG"/>
+                    <pic:cNvPicPr>
+                      <a:picLocks noChangeAspect="1" noChangeArrowheads="1"/>
+                    </pic:cNvPicPr>
+                  </pic:nvPicPr>
+                  <pic:blipFill>
+                    <a:blip r:embed="rId16" cstate="print">
+                      <a:extLst>
+                        <a:ext uri="{28A0092B-C50C-407E-A947-70E740481C1C}">
+                          <a14:useLocalDpi xmlns:a14="http://schemas.microsoft.com/office/drawing/2010/main" val="0"/>
+                        </a:ext>
+                      </a:extLst>
+                    </a:blip>
+                    <a:srcRect/>
+                    <a:stretch>
+                      <a:fillRect/>
+                    </a:stretch>
+                  </pic:blipFill>
+                  <pic:spPr bwMode="auto">
+                    <a:xfrm>
+                      <a:off x="0" y="0"/>
+                      <a:ext cx="5943600" cy="4438650"/>
+                    </a:xfrm>
+                    <a:prstGeom prst="rect">
+                      <a:avLst/>
+                    </a:prstGeom>
+                    <a:noFill/>
+                    <a:ln>
+                      <a:noFill/>
+                    </a:ln>
+                  </pic:spPr>
+                </pic:pic>
+              </a:graphicData>
+            </a:graphic>
+          </wp:inline>
+        </w:drawing>
+      </w:r>
+    </w:p>
+    <w:p>
+      <w:pPr>
+        <w:pStyle w:val="Caption"/>
+      </w:pPr>
+      <w:bookmarkStart w:id="35" w:name="_Toc336940751"/>
+      <w:r>
+        <w:t xml:space="preserve">Figure </w:t>
+      </w:r>
+      <w:fldSimple w:instr=" SEQ Figure \* ARABIC ">
+        <w:r>
+          <w:rPr>
+            <w:noProof/>
+          </w:rPr>
+          <w:t>7</w:t>
+        </w:r>
+      </w:fldSimple>
+      <w:r>
+        <w:t xml:space="preserve"> - Help Popover</w:t>
+      </w:r>
+      <w:bookmarkEnd w:id="35"/>
+    </w:p>
+    <w:p>
+      <w:r>
+        <w:t xml:space="preserve">At any time during gameplay, the user can hit the Info button their remote and bring up the Help popover. </w:t>
+      </w:r>
+      <w:r>
+        <w:t>When the user is done reading and wants to return to the game, any button press will exit the popover.</w:t>
+      </w:r>
+    </w:p>
+    <w:p>
+      <w:pPr>
+        <w:keepNext/>
+      </w:pPr>
       <w:r>
         <w:rPr>
           <w:noProof/>
         </w:rPr>
-        <w:fldChar w:fldCharType="end"/>
-      </w:r>
+        <w:lastRenderedPageBreak/>
+        <w:drawing>
+          <wp:inline distT="0" distB="0" distL="0" distR="0" wp14:anchorId="4C488E32" wp14:editId="1683EC5C">
+            <wp:extent cx="5943600" cy="4438650"/>
+            <wp:effectExtent l="0" t="0" r="0" b="0"/>
+            <wp:docPr id="10" name="Picture 10" descr="C:\Users\Davidj\Documents\GitHub\STBMF\CONOPS\photo 5.JPG"/>
+            <wp:cNvGraphicFramePr>
+              <a:graphicFrameLocks xmlns:a="http://schemas.openxmlformats.org/drawingml/2006/main" noChangeAspect="1"/>
+            </wp:cNvGraphicFramePr>
+            <a:graphic xmlns:a="http://schemas.openxmlformats.org/drawingml/2006/main">
+              <a:graphicData uri="http://schemas.openxmlformats.org/drawingml/2006/picture">
+                <pic:pic xmlns:pic="http://schemas.openxmlformats.org/drawingml/2006/picture">
+                  <pic:nvPicPr>
+                    <pic:cNvPr id="0" name="Picture 9" descr="C:\Users\Davidj\Documents\GitHub\STBMF\CONOPS\photo 5.JPG"/>
+                    <pic:cNvPicPr>
+                      <a:picLocks noChangeAspect="1" noChangeArrowheads="1"/>
+                    </pic:cNvPicPr>
+                  </pic:nvPicPr>
+                  <pic:blipFill>
+                    <a:blip r:embed="rId17" cstate="print">
+                      <a:extLst>
+                        <a:ext uri="{28A0092B-C50C-407E-A947-70E740481C1C}">
+                          <a14:useLocalDpi xmlns:a14="http://schemas.microsoft.com/office/drawing/2010/main" val="0"/>
+                        </a:ext>
+                      </a:extLst>
+                    </a:blip>
+                    <a:srcRect/>
+                    <a:stretch>
+                      <a:fillRect/>
+                    </a:stretch>
+                  </pic:blipFill>
+                  <pic:spPr bwMode="auto">
+                    <a:xfrm>
+                      <a:off x="0" y="0"/>
+                      <a:ext cx="5943600" cy="4438650"/>
+                    </a:xfrm>
+                    <a:prstGeom prst="rect">
+                      <a:avLst/>
+                    </a:prstGeom>
+                    <a:noFill/>
+                    <a:ln>
+                      <a:noFill/>
+                    </a:ln>
+                  </pic:spPr>
+                </pic:pic>
+              </a:graphicData>
+            </a:graphic>
+          </wp:inline>
+        </w:drawing>
+      </w:r>
+    </w:p>
+    <w:p>
+      <w:pPr>
+        <w:pStyle w:val="Caption"/>
+      </w:pPr>
+      <w:bookmarkStart w:id="36" w:name="_Toc336940752"/>
+      <w:r>
+        <w:t xml:space="preserve">Figure </w:t>
+      </w:r>
+      <w:fldSimple w:instr=" SEQ Figure \* ARABIC ">
+        <w:r>
+          <w:rPr>
+            <w:noProof/>
+          </w:rPr>
+          <w:t>8</w:t>
+        </w:r>
+      </w:fldSimple>
       <w:r>
         <w:t xml:space="preserve"> – Gameplay</w:t>
       </w:r>
-      <w:bookmarkEnd w:id="23"/>
+      <w:bookmarkEnd w:id="36"/>
     </w:p>
     <w:p>
       <w:r>
@@ -3682,11 +3811,11 @@
           <w:numId w:val="5"/>
         </w:numPr>
       </w:pPr>
-      <w:bookmarkStart w:id="24" w:name="_Toc336947280"/>
+      <w:bookmarkStart w:id="37" w:name="_Toc342144246"/>
       <w:r>
         <w:t>Summary of Impacts</w:t>
       </w:r>
-      <w:bookmarkEnd w:id="24"/>
+      <w:bookmarkEnd w:id="37"/>
     </w:p>
     <w:p>
       <w:pPr>
@@ -3710,18 +3839,36 @@
           <w:szCs w:val="28"/>
         </w:rPr>
       </w:pPr>
+      <w:bookmarkStart w:id="38" w:name="_Toc342144229"/>
+      <w:bookmarkStart w:id="39" w:name="_Toc342144247"/>
+      <w:bookmarkEnd w:id="38"/>
+      <w:bookmarkEnd w:id="39"/>
     </w:p>
     <w:p>
       <w:pPr>
         <w:pStyle w:val="Heading2"/>
       </w:pPr>
+      <w:bookmarkStart w:id="40" w:name="_Toc342144248"/>
       <w:r>
         <w:t>Client</w:t>
       </w:r>
-    </w:p>
-    <w:p>
-      <w:r>
-        <w:t>Innovative Systems’ clients will have another new and unprecedented feature to attract new subscribers and keep existing subscriber</w:t>
+      <w:bookmarkEnd w:id="40"/>
+    </w:p>
+    <w:p>
+      <w:r>
+        <w:t>Innovative Systems’ clients</w:t>
+      </w:r>
+      <w:r>
+        <w:t xml:space="preserve"> (</w:t>
+      </w:r>
+      <w:r>
+        <w:t>Telecommunication companies</w:t>
+      </w:r>
+      <w:r>
+        <w:t>)</w:t>
+      </w:r>
+      <w:r>
+        <w:t xml:space="preserve"> will have another new and unprecedented feature to attract new subscribers and keep existing subscriber</w:t>
       </w:r>
       <w:r>
         <w:t>s interested in their services. Once the system is in place, adding new games will have little to no cost for the client</w:t>
@@ -3734,10 +3881,12 @@
       <w:pPr>
         <w:pStyle w:val="Heading2"/>
       </w:pPr>
+      <w:bookmarkStart w:id="41" w:name="_Toc342144249"/>
       <w:r>
         <w:lastRenderedPageBreak/>
         <w:t>Subscriber</w:t>
       </w:r>
+      <w:bookmarkEnd w:id="41"/>
     </w:p>
     <w:p>
       <w:r>
@@ -3748,13 +3897,117 @@
       </w:r>
     </w:p>
     <w:sectPr>
+      <w:headerReference w:type="default" r:id="rId18"/>
       <w:pgSz w:w="12240" w:h="15840"/>
       <w:pgMar w:top="1440" w:right="1440" w:bottom="1440" w:left="1440" w:header="720" w:footer="720" w:gutter="0"/>
       <w:cols w:space="720"/>
+      <w:titlePg/>
       <w:docGrid w:linePitch="360"/>
     </w:sectPr>
   </w:body>
 </w:document>
+</file>
+
+<file path=word/endnotes.xml><?xml version="1.0" encoding="utf-8"?>
+<w:endnotes xmlns:wpc="http://schemas.microsoft.com/office/word/2010/wordprocessingCanvas" xmlns:mc="http://schemas.openxmlformats.org/markup-compatibility/2006" xmlns:o="urn:schemas-microsoft-com:office:office" xmlns:r="http://schemas.openxmlformats.org/officeDocument/2006/relationships" xmlns:m="http://schemas.openxmlformats.org/officeDocument/2006/math" xmlns:v="urn:schemas-microsoft-com:vml" xmlns:wp14="http://schemas.microsoft.com/office/word/2010/wordprocessingDrawing" xmlns:wp="http://schemas.openxmlformats.org/drawingml/2006/wordprocessingDrawing" xmlns:w10="urn:schemas-microsoft-com:office:word" xmlns:w="http://schemas.openxmlformats.org/wordprocessingml/2006/main" xmlns:w14="http://schemas.microsoft.com/office/word/2010/wordml" xmlns:wpg="http://schemas.microsoft.com/office/word/2010/wordprocessingGroup" xmlns:wpi="http://schemas.microsoft.com/office/word/2010/wordprocessingInk" xmlns:wne="http://schemas.microsoft.com/office/word/2006/wordml" xmlns:wps="http://schemas.microsoft.com/office/word/2010/wordprocessingShape" mc:Ignorable="w14 wp14">
+  <w:endnote w:type="separator" w:id="-1">
+    <w:p>
+      <w:pPr>
+        <w:spacing w:after="0" w:line="240" w:lineRule="auto"/>
+      </w:pPr>
+      <w:r>
+        <w:separator/>
+      </w:r>
+    </w:p>
+  </w:endnote>
+  <w:endnote w:type="continuationSeparator" w:id="0">
+    <w:p>
+      <w:pPr>
+        <w:spacing w:after="0" w:line="240" w:lineRule="auto"/>
+      </w:pPr>
+      <w:r>
+        <w:continuationSeparator/>
+      </w:r>
+    </w:p>
+  </w:endnote>
+</w:endnotes>
+</file>
+
+<file path=word/footnotes.xml><?xml version="1.0" encoding="utf-8"?>
+<w:footnotes xmlns:wpc="http://schemas.microsoft.com/office/word/2010/wordprocessingCanvas" xmlns:mc="http://schemas.openxmlformats.org/markup-compatibility/2006" xmlns:o="urn:schemas-microsoft-com:office:office" xmlns:r="http://schemas.openxmlformats.org/officeDocument/2006/relationships" xmlns:m="http://schemas.openxmlformats.org/officeDocument/2006/math" xmlns:v="urn:schemas-microsoft-com:vml" xmlns:wp14="http://schemas.microsoft.com/office/word/2010/wordprocessingDrawing" xmlns:wp="http://schemas.openxmlformats.org/drawingml/2006/wordprocessingDrawing" xmlns:w10="urn:schemas-microsoft-com:office:word" xmlns:w="http://schemas.openxmlformats.org/wordprocessingml/2006/main" xmlns:w14="http://schemas.microsoft.com/office/word/2010/wordml" xmlns:wpg="http://schemas.microsoft.com/office/word/2010/wordprocessingGroup" xmlns:wpi="http://schemas.microsoft.com/office/word/2010/wordprocessingInk" xmlns:wne="http://schemas.microsoft.com/office/word/2006/wordml" xmlns:wps="http://schemas.microsoft.com/office/word/2010/wordprocessingShape" mc:Ignorable="w14 wp14">
+  <w:footnote w:type="separator" w:id="-1">
+    <w:p>
+      <w:pPr>
+        <w:spacing w:after="0" w:line="240" w:lineRule="auto"/>
+      </w:pPr>
+      <w:r>
+        <w:separator/>
+      </w:r>
+    </w:p>
+  </w:footnote>
+  <w:footnote w:type="continuationSeparator" w:id="0">
+    <w:p>
+      <w:pPr>
+        <w:spacing w:after="0" w:line="240" w:lineRule="auto"/>
+      </w:pPr>
+      <w:r>
+        <w:continuationSeparator/>
+      </w:r>
+    </w:p>
+  </w:footnote>
+</w:footnotes>
+</file>
+
+<file path=word/header1.xml><?xml version="1.0" encoding="utf-8"?>
+<w:hdr xmlns:wpc="http://schemas.microsoft.com/office/word/2010/wordprocessingCanvas" xmlns:mc="http://schemas.openxmlformats.org/markup-compatibility/2006" xmlns:o="urn:schemas-microsoft-com:office:office" xmlns:r="http://schemas.openxmlformats.org/officeDocument/2006/relationships" xmlns:m="http://schemas.openxmlformats.org/officeDocument/2006/math" xmlns:v="urn:schemas-microsoft-com:vml" xmlns:wp14="http://schemas.microsoft.com/office/word/2010/wordprocessingDrawing" xmlns:wp="http://schemas.openxmlformats.org/drawingml/2006/wordprocessingDrawing" xmlns:w10="urn:schemas-microsoft-com:office:word" xmlns:w="http://schemas.openxmlformats.org/wordprocessingml/2006/main" xmlns:w14="http://schemas.microsoft.com/office/word/2010/wordml" xmlns:wpg="http://schemas.microsoft.com/office/word/2010/wordprocessingGroup" xmlns:wpi="http://schemas.microsoft.com/office/word/2010/wordprocessingInk" xmlns:wne="http://schemas.microsoft.com/office/word/2006/wordml" xmlns:wps="http://schemas.microsoft.com/office/word/2010/wordprocessingShape" mc:Ignorable="w14 wp14">
+  <w:sdt>
+    <w:sdtPr>
+      <w:id w:val="2010480673"/>
+      <w:docPartObj>
+        <w:docPartGallery w:val="Page Numbers (Top of Page)"/>
+        <w:docPartUnique/>
+      </w:docPartObj>
+    </w:sdtPr>
+    <w:sdtEndPr>
+      <w:rPr>
+        <w:noProof/>
+      </w:rPr>
+    </w:sdtEndPr>
+    <w:sdtContent>
+      <w:p>
+        <w:pPr>
+          <w:pStyle w:val="Header"/>
+        </w:pPr>
+        <w:r>
+          <w:fldChar w:fldCharType="begin"/>
+        </w:r>
+        <w:r>
+          <w:instrText xml:space="preserve"> PAGE   \* MERGEFORMAT </w:instrText>
+        </w:r>
+        <w:r>
+          <w:fldChar w:fldCharType="separate"/>
+        </w:r>
+        <w:r>
+          <w:rPr>
+            <w:noProof/>
+          </w:rPr>
+          <w:t>2</w:t>
+        </w:r>
+        <w:r>
+          <w:rPr>
+            <w:noProof/>
+          </w:rPr>
+          <w:fldChar w:fldCharType="end"/>
+        </w:r>
+      </w:p>
+    </w:sdtContent>
+  </w:sdt>
+  <w:p>
+    <w:pPr>
+      <w:pStyle w:val="Header"/>
+    </w:pPr>
+  </w:p>
+</w:hdr>
 </file>
 
 <file path=word/numbering.xml><?xml version="1.0" encoding="utf-8"?>
@@ -5344,6 +5597,50 @@
       <w:spacing w:after="0" w:line="240" w:lineRule="auto"/>
     </w:pPr>
   </w:style>
+  <w:style w:type="paragraph" w:styleId="Header">
+    <w:name w:val="header"/>
+    <w:basedOn w:val="Normal"/>
+    <w:link w:val="HeaderChar"/>
+    <w:uiPriority w:val="99"/>
+    <w:unhideWhenUsed/>
+    <w:rsid w:val="00BB541B"/>
+    <w:pPr>
+      <w:tabs>
+        <w:tab w:val="center" w:pos="4680"/>
+        <w:tab w:val="right" w:pos="9360"/>
+      </w:tabs>
+      <w:spacing w:after="0" w:line="240" w:lineRule="auto"/>
+    </w:pPr>
+  </w:style>
+  <w:style w:type="character" w:customStyle="1" w:styleId="HeaderChar">
+    <w:name w:val="Header Char"/>
+    <w:basedOn w:val="DefaultParagraphFont"/>
+    <w:link w:val="Header"/>
+    <w:uiPriority w:val="99"/>
+    <w:rsid w:val="00BB541B"/>
+  </w:style>
+  <w:style w:type="paragraph" w:styleId="Footer">
+    <w:name w:val="footer"/>
+    <w:basedOn w:val="Normal"/>
+    <w:link w:val="FooterChar"/>
+    <w:uiPriority w:val="99"/>
+    <w:unhideWhenUsed/>
+    <w:rsid w:val="00BB541B"/>
+    <w:pPr>
+      <w:tabs>
+        <w:tab w:val="center" w:pos="4680"/>
+        <w:tab w:val="right" w:pos="9360"/>
+      </w:tabs>
+      <w:spacing w:after="0" w:line="240" w:lineRule="auto"/>
+    </w:pPr>
+  </w:style>
+  <w:style w:type="character" w:customStyle="1" w:styleId="FooterChar">
+    <w:name w:val="Footer Char"/>
+    <w:basedOn w:val="DefaultParagraphFont"/>
+    <w:link w:val="Footer"/>
+    <w:uiPriority w:val="99"/>
+    <w:rsid w:val="00BB541B"/>
+  </w:style>
 </w:styles>
 </file>
 
@@ -6153,6 +6450,50 @@
     <w:pPr>
       <w:spacing w:after="0" w:line="240" w:lineRule="auto"/>
     </w:pPr>
+  </w:style>
+  <w:style w:type="paragraph" w:styleId="Header">
+    <w:name w:val="header"/>
+    <w:basedOn w:val="Normal"/>
+    <w:link w:val="HeaderChar"/>
+    <w:uiPriority w:val="99"/>
+    <w:unhideWhenUsed/>
+    <w:rsid w:val="00BB541B"/>
+    <w:pPr>
+      <w:tabs>
+        <w:tab w:val="center" w:pos="4680"/>
+        <w:tab w:val="right" w:pos="9360"/>
+      </w:tabs>
+      <w:spacing w:after="0" w:line="240" w:lineRule="auto"/>
+    </w:pPr>
+  </w:style>
+  <w:style w:type="character" w:customStyle="1" w:styleId="HeaderChar">
+    <w:name w:val="Header Char"/>
+    <w:basedOn w:val="DefaultParagraphFont"/>
+    <w:link w:val="Header"/>
+    <w:uiPriority w:val="99"/>
+    <w:rsid w:val="00BB541B"/>
+  </w:style>
+  <w:style w:type="paragraph" w:styleId="Footer">
+    <w:name w:val="footer"/>
+    <w:basedOn w:val="Normal"/>
+    <w:link w:val="FooterChar"/>
+    <w:uiPriority w:val="99"/>
+    <w:unhideWhenUsed/>
+    <w:rsid w:val="00BB541B"/>
+    <w:pPr>
+      <w:tabs>
+        <w:tab w:val="center" w:pos="4680"/>
+        <w:tab w:val="right" w:pos="9360"/>
+      </w:tabs>
+      <w:spacing w:after="0" w:line="240" w:lineRule="auto"/>
+    </w:pPr>
+  </w:style>
+  <w:style w:type="character" w:customStyle="1" w:styleId="FooterChar">
+    <w:name w:val="Footer Char"/>
+    <w:basedOn w:val="DefaultParagraphFont"/>
+    <w:link w:val="Footer"/>
+    <w:uiPriority w:val="99"/>
+    <w:rsid w:val="00BB541B"/>
   </w:style>
 </w:styles>
 </file>
@@ -6447,7 +6788,7 @@
 </file>
 
 <file path=customXml/itemProps1.xml><?xml version="1.0" encoding="utf-8"?>
-<ds:datastoreItem xmlns:ds="http://schemas.openxmlformats.org/officeDocument/2006/customXml" ds:itemID="{A87E6D5D-5414-4892-95DE-05F1F6ECA974}">
+<ds:datastoreItem xmlns:ds="http://schemas.openxmlformats.org/officeDocument/2006/customXml" ds:itemID="{5C41D697-EE6D-4C80-B0D5-473B1C9C08EF}">
   <ds:schemaRefs>
     <ds:schemaRef ds:uri="http://schemas.openxmlformats.org/officeDocument/2006/bibliography"/>
   </ds:schemaRefs>

</xml_diff>

<commit_message>
Moved my resume and sprints to docs directory
</commit_message>
<xml_diff>
--- a/docs/srDesign_CONOPS.docx
+++ b/docs/srDesign_CONOPS.docx
@@ -93,7 +93,7 @@
           <w:rStyle w:val="IntenseEmphasis"/>
           <w:i/>
         </w:rPr>
-        <w:t>STBMF</w:t>
+        <w:t>Plugged In</w:t>
       </w:r>
     </w:p>
     <w:p>
@@ -890,7 +890,7 @@
           <w:r>
             <w:fldChar w:fldCharType="separate"/>
           </w:r>
-          <w:hyperlink w:anchor="_Toc342233024" w:history="1">
+          <w:hyperlink w:anchor="_Toc342235066" w:history="1">
             <w:r>
               <w:rPr>
                 <w:rStyle w:val="Hyperlink"/>
@@ -917,7 +917,7 @@
                 <w:noProof/>
                 <w:webHidden/>
               </w:rPr>
-              <w:instrText xml:space="preserve"> PAGEREF _Toc342233024 \h </w:instrText>
+              <w:instrText xml:space="preserve"> PAGEREF _Toc342235066 \h </w:instrText>
             </w:r>
             <w:r>
               <w:rPr>
@@ -956,7 +956,7 @@
               <w:noProof/>
             </w:rPr>
           </w:pPr>
-          <w:hyperlink w:anchor="_Toc342233025" w:history="1">
+          <w:hyperlink w:anchor="_Toc342235067" w:history="1">
             <w:r>
               <w:rPr>
                 <w:rStyle w:val="Hyperlink"/>
@@ -997,7 +997,7 @@
                 <w:noProof/>
                 <w:webHidden/>
               </w:rPr>
-              <w:instrText xml:space="preserve"> PAGEREF _Toc342233025 \h </w:instrText>
+              <w:instrText xml:space="preserve"> PAGEREF _Toc342235067 \h </w:instrText>
             </w:r>
             <w:r>
               <w:rPr>
@@ -1036,7 +1036,7 @@
               <w:noProof/>
             </w:rPr>
           </w:pPr>
-          <w:hyperlink w:anchor="_Toc342233026" w:history="1">
+          <w:hyperlink w:anchor="_Toc342235068" w:history="1">
             <w:r>
               <w:rPr>
                 <w:rStyle w:val="Hyperlink"/>
@@ -1077,7 +1077,7 @@
                 <w:noProof/>
                 <w:webHidden/>
               </w:rPr>
-              <w:instrText xml:space="preserve"> PAGEREF _Toc342233026 \h </w:instrText>
+              <w:instrText xml:space="preserve"> PAGEREF _Toc342235068 \h </w:instrText>
             </w:r>
             <w:r>
               <w:rPr>
@@ -1116,7 +1116,7 @@
               <w:noProof/>
             </w:rPr>
           </w:pPr>
-          <w:hyperlink w:anchor="_Toc342233027" w:history="1">
+          <w:hyperlink w:anchor="_Toc342235069" w:history="1">
             <w:r>
               <w:rPr>
                 <w:rStyle w:val="Hyperlink"/>
@@ -1157,7 +1157,7 @@
                 <w:noProof/>
                 <w:webHidden/>
               </w:rPr>
-              <w:instrText xml:space="preserve"> PAGEREF _Toc342233027 \h </w:instrText>
+              <w:instrText xml:space="preserve"> PAGEREF _Toc342235069 \h </w:instrText>
             </w:r>
             <w:r>
               <w:rPr>
@@ -1196,7 +1196,7 @@
               <w:noProof/>
             </w:rPr>
           </w:pPr>
-          <w:hyperlink w:anchor="_Toc342233028" w:history="1">
+          <w:hyperlink w:anchor="_Toc342235070" w:history="1">
             <w:r>
               <w:rPr>
                 <w:rStyle w:val="Hyperlink"/>
@@ -1237,7 +1237,7 @@
                 <w:noProof/>
                 <w:webHidden/>
               </w:rPr>
-              <w:instrText xml:space="preserve"> PAGEREF _Toc342233028 \h </w:instrText>
+              <w:instrText xml:space="preserve"> PAGEREF _Toc342235070 \h </w:instrText>
             </w:r>
             <w:r>
               <w:rPr>
@@ -1280,13 +1280,13 @@
               <w:noProof/>
             </w:rPr>
           </w:pPr>
-          <w:hyperlink w:anchor="_Toc342233032" w:history="1">
+          <w:hyperlink w:anchor="_Toc342235071" w:history="1">
             <w:r>
               <w:rPr>
                 <w:rStyle w:val="Hyperlink"/>
                 <w:noProof/>
               </w:rPr>
-              <w:t>3.1</w:t>
+              <w:t>4.1</w:t>
             </w:r>
             <w:r>
               <w:rPr>
@@ -1321,7 +1321,7 @@
                 <w:noProof/>
                 <w:webHidden/>
               </w:rPr>
-              <w:instrText xml:space="preserve"> PAGEREF _Toc342233032 \h </w:instrText>
+              <w:instrText xml:space="preserve"> PAGEREF _Toc342235071 \h </w:instrText>
             </w:r>
             <w:r>
               <w:rPr>
@@ -1364,13 +1364,13 @@
               <w:noProof/>
             </w:rPr>
           </w:pPr>
-          <w:hyperlink w:anchor="_Toc342233033" w:history="1">
+          <w:hyperlink w:anchor="_Toc342235072" w:history="1">
             <w:r>
               <w:rPr>
                 <w:rStyle w:val="Hyperlink"/>
                 <w:noProof/>
               </w:rPr>
-              <w:t>3.2</w:t>
+              <w:t>4.2</w:t>
             </w:r>
             <w:r>
               <w:rPr>
@@ -1405,7 +1405,7 @@
                 <w:noProof/>
                 <w:webHidden/>
               </w:rPr>
-              <w:instrText xml:space="preserve"> PAGEREF _Toc342233033 \h </w:instrText>
+              <w:instrText xml:space="preserve"> PAGEREF _Toc342235072 \h </w:instrText>
             </w:r>
             <w:r>
               <w:rPr>
@@ -1425,7 +1425,7 @@
                 <w:noProof/>
                 <w:webHidden/>
               </w:rPr>
-              <w:t>3</w:t>
+              <w:t>4</w:t>
             </w:r>
             <w:r>
               <w:rPr>
@@ -1448,13 +1448,13 @@
               <w:noProof/>
             </w:rPr>
           </w:pPr>
-          <w:hyperlink w:anchor="_Toc342233034" w:history="1">
+          <w:hyperlink w:anchor="_Toc342235073" w:history="1">
             <w:r>
               <w:rPr>
                 <w:rStyle w:val="Hyperlink"/>
                 <w:noProof/>
               </w:rPr>
-              <w:t>3.3</w:t>
+              <w:t>4.3</w:t>
             </w:r>
             <w:r>
               <w:rPr>
@@ -1489,7 +1489,7 @@
                 <w:noProof/>
                 <w:webHidden/>
               </w:rPr>
-              <w:instrText xml:space="preserve"> PAGEREF _Toc342233034 \h </w:instrText>
+              <w:instrText xml:space="preserve"> PAGEREF _Toc342235073 \h </w:instrText>
             </w:r>
             <w:r>
               <w:rPr>
@@ -1532,13 +1532,13 @@
               <w:noProof/>
             </w:rPr>
           </w:pPr>
-          <w:hyperlink w:anchor="_Toc342233035" w:history="1">
+          <w:hyperlink w:anchor="_Toc342235074" w:history="1">
             <w:r>
               <w:rPr>
                 <w:rStyle w:val="Hyperlink"/>
                 <w:noProof/>
               </w:rPr>
-              <w:t>3.4</w:t>
+              <w:t>4.4</w:t>
             </w:r>
             <w:r>
               <w:rPr>
@@ -1573,7 +1573,7 @@
                 <w:noProof/>
                 <w:webHidden/>
               </w:rPr>
-              <w:instrText xml:space="preserve"> PAGEREF _Toc342233035 \h </w:instrText>
+              <w:instrText xml:space="preserve"> PAGEREF _Toc342235074 \h </w:instrText>
             </w:r>
             <w:r>
               <w:rPr>
@@ -1616,13 +1616,13 @@
               <w:noProof/>
             </w:rPr>
           </w:pPr>
-          <w:hyperlink w:anchor="_Toc342233036" w:history="1">
+          <w:hyperlink w:anchor="_Toc342235075" w:history="1">
             <w:r>
               <w:rPr>
                 <w:rStyle w:val="Hyperlink"/>
                 <w:noProof/>
               </w:rPr>
-              <w:t>3.5</w:t>
+              <w:t>4.5</w:t>
             </w:r>
             <w:r>
               <w:rPr>
@@ -1657,7 +1657,7 @@
                 <w:noProof/>
                 <w:webHidden/>
               </w:rPr>
-              <w:instrText xml:space="preserve"> PAGEREF _Toc342233036 \h </w:instrText>
+              <w:instrText xml:space="preserve"> PAGEREF _Toc342235075 \h </w:instrText>
             </w:r>
             <w:r>
               <w:rPr>
@@ -1696,13 +1696,13 @@
               <w:noProof/>
             </w:rPr>
           </w:pPr>
-          <w:hyperlink w:anchor="_Toc342233037" w:history="1">
+          <w:hyperlink w:anchor="_Toc342235076" w:history="1">
             <w:r>
               <w:rPr>
                 <w:rStyle w:val="Hyperlink"/>
                 <w:noProof/>
               </w:rPr>
-              <w:t>4.</w:t>
+              <w:t>5.</w:t>
             </w:r>
             <w:r>
               <w:rPr>
@@ -1737,7 +1737,7 @@
                 <w:noProof/>
                 <w:webHidden/>
               </w:rPr>
-              <w:instrText xml:space="preserve"> PAGEREF _Toc342233037 \h </w:instrText>
+              <w:instrText xml:space="preserve"> PAGEREF _Toc342235076 \h </w:instrText>
             </w:r>
             <w:r>
               <w:rPr>
@@ -1780,13 +1780,13 @@
               <w:noProof/>
             </w:rPr>
           </w:pPr>
-          <w:hyperlink w:anchor="_Toc342233038" w:history="1">
+          <w:hyperlink w:anchor="_Toc342235077" w:history="1">
             <w:r>
               <w:rPr>
                 <w:rStyle w:val="Hyperlink"/>
                 <w:noProof/>
               </w:rPr>
-              <w:t>4.1</w:t>
+              <w:t>5.1</w:t>
             </w:r>
             <w:r>
               <w:rPr>
@@ -1821,7 +1821,7 @@
                 <w:noProof/>
                 <w:webHidden/>
               </w:rPr>
-              <w:instrText xml:space="preserve"> PAGEREF _Toc342233038 \h </w:instrText>
+              <w:instrText xml:space="preserve"> PAGEREF _Toc342235077 \h </w:instrText>
             </w:r>
             <w:r>
               <w:rPr>
@@ -1864,13 +1864,13 @@
               <w:noProof/>
             </w:rPr>
           </w:pPr>
-          <w:hyperlink w:anchor="_Toc342233039" w:history="1">
+          <w:hyperlink w:anchor="_Toc342235078" w:history="1">
             <w:r>
               <w:rPr>
                 <w:rStyle w:val="Hyperlink"/>
                 <w:noProof/>
               </w:rPr>
-              <w:t>4.2</w:t>
+              <w:t>5.2</w:t>
             </w:r>
             <w:r>
               <w:rPr>
@@ -1905,7 +1905,7 @@
                 <w:noProof/>
                 <w:webHidden/>
               </w:rPr>
-              <w:instrText xml:space="preserve"> PAGEREF _Toc342233039 \h </w:instrText>
+              <w:instrText xml:space="preserve"> PAGEREF _Toc342235078 \h </w:instrText>
             </w:r>
             <w:r>
               <w:rPr>
@@ -1948,13 +1948,13 @@
               <w:noProof/>
             </w:rPr>
           </w:pPr>
-          <w:hyperlink w:anchor="_Toc342233040" w:history="1">
+          <w:hyperlink w:anchor="_Toc342235079" w:history="1">
             <w:r>
               <w:rPr>
                 <w:rStyle w:val="Hyperlink"/>
                 <w:noProof/>
               </w:rPr>
-              <w:t>4.3</w:t>
+              <w:t>5.3</w:t>
             </w:r>
             <w:r>
               <w:rPr>
@@ -1989,7 +1989,7 @@
                 <w:noProof/>
                 <w:webHidden/>
               </w:rPr>
-              <w:instrText xml:space="preserve"> PAGEREF _Toc342233040 \h </w:instrText>
+              <w:instrText xml:space="preserve"> PAGEREF _Toc342235079 \h </w:instrText>
             </w:r>
             <w:r>
               <w:rPr>
@@ -2032,13 +2032,13 @@
               <w:noProof/>
             </w:rPr>
           </w:pPr>
-          <w:hyperlink w:anchor="_Toc342233041" w:history="1">
+          <w:hyperlink w:anchor="_Toc342235080" w:history="1">
             <w:r>
               <w:rPr>
                 <w:rStyle w:val="Hyperlink"/>
                 <w:noProof/>
               </w:rPr>
-              <w:t>4.4</w:t>
+              <w:t>5.4</w:t>
             </w:r>
             <w:r>
               <w:rPr>
@@ -2073,7 +2073,7 @@
                 <w:noProof/>
                 <w:webHidden/>
               </w:rPr>
-              <w:instrText xml:space="preserve"> PAGEREF _Toc342233041 \h </w:instrText>
+              <w:instrText xml:space="preserve"> PAGEREF _Toc342235080 \h </w:instrText>
             </w:r>
             <w:r>
               <w:rPr>
@@ -2116,13 +2116,13 @@
               <w:noProof/>
             </w:rPr>
           </w:pPr>
-          <w:hyperlink w:anchor="_Toc342233042" w:history="1">
+          <w:hyperlink w:anchor="_Toc342235081" w:history="1">
             <w:r>
               <w:rPr>
                 <w:rStyle w:val="Hyperlink"/>
                 <w:noProof/>
               </w:rPr>
-              <w:t>4.5</w:t>
+              <w:t>5.5</w:t>
             </w:r>
             <w:r>
               <w:rPr>
@@ -2157,7 +2157,7 @@
                 <w:noProof/>
                 <w:webHidden/>
               </w:rPr>
-              <w:instrText xml:space="preserve"> PAGEREF _Toc342233042 \h </w:instrText>
+              <w:instrText xml:space="preserve"> PAGEREF _Toc342235081 \h </w:instrText>
             </w:r>
             <w:r>
               <w:rPr>
@@ -2196,13 +2196,13 @@
               <w:noProof/>
             </w:rPr>
           </w:pPr>
-          <w:hyperlink w:anchor="_Toc342233043" w:history="1">
+          <w:hyperlink w:anchor="_Toc342235082" w:history="1">
             <w:r>
               <w:rPr>
                 <w:rStyle w:val="Hyperlink"/>
                 <w:noProof/>
               </w:rPr>
-              <w:t>5.</w:t>
+              <w:t>6.</w:t>
             </w:r>
             <w:r>
               <w:rPr>
@@ -2237,7 +2237,7 @@
                 <w:noProof/>
                 <w:webHidden/>
               </w:rPr>
-              <w:instrText xml:space="preserve"> PAGEREF _Toc342233043 \h </w:instrText>
+              <w:instrText xml:space="preserve"> PAGEREF _Toc342235082 \h </w:instrText>
             </w:r>
             <w:r>
               <w:rPr>
@@ -2280,13 +2280,13 @@
               <w:noProof/>
             </w:rPr>
           </w:pPr>
-          <w:hyperlink w:anchor="_Toc342233044" w:history="1">
+          <w:hyperlink w:anchor="_Toc342235083" w:history="1">
             <w:r>
               <w:rPr>
                 <w:rStyle w:val="Hyperlink"/>
                 <w:noProof/>
               </w:rPr>
-              <w:t>5.1</w:t>
+              <w:t>6.1</w:t>
             </w:r>
             <w:r>
               <w:rPr>
@@ -2321,7 +2321,7 @@
                 <w:noProof/>
                 <w:webHidden/>
               </w:rPr>
-              <w:instrText xml:space="preserve"> PAGEREF _Toc342233044 \h </w:instrText>
+              <w:instrText xml:space="preserve"> PAGEREF _Toc342235083 \h </w:instrText>
             </w:r>
             <w:r>
               <w:rPr>
@@ -2360,13 +2360,13 @@
               <w:noProof/>
             </w:rPr>
           </w:pPr>
-          <w:hyperlink w:anchor="_Toc342233045" w:history="1">
+          <w:hyperlink w:anchor="_Toc342235084" w:history="1">
             <w:r>
               <w:rPr>
                 <w:rStyle w:val="Hyperlink"/>
                 <w:noProof/>
               </w:rPr>
-              <w:t>6.</w:t>
+              <w:t>7.</w:t>
             </w:r>
             <w:r>
               <w:rPr>
@@ -2401,7 +2401,7 @@
                 <w:noProof/>
                 <w:webHidden/>
               </w:rPr>
-              <w:instrText xml:space="preserve"> PAGEREF _Toc342233045 \h </w:instrText>
+              <w:instrText xml:space="preserve"> PAGEREF _Toc342235084 \h </w:instrText>
             </w:r>
             <w:r>
               <w:rPr>
@@ -2444,13 +2444,13 @@
               <w:noProof/>
             </w:rPr>
           </w:pPr>
-          <w:hyperlink w:anchor="_Toc342233046" w:history="1">
+          <w:hyperlink w:anchor="_Toc342235085" w:history="1">
             <w:r>
               <w:rPr>
                 <w:rStyle w:val="Hyperlink"/>
                 <w:noProof/>
               </w:rPr>
-              <w:t>6.1</w:t>
+              <w:t>7.1</w:t>
             </w:r>
             <w:r>
               <w:rPr>
@@ -2485,7 +2485,7 @@
                 <w:noProof/>
                 <w:webHidden/>
               </w:rPr>
-              <w:instrText xml:space="preserve"> PAGEREF _Toc342233046 \h </w:instrText>
+              <w:instrText xml:space="preserve"> PAGEREF _Toc342235085 \h </w:instrText>
             </w:r>
             <w:r>
               <w:rPr>
@@ -2528,13 +2528,13 @@
               <w:noProof/>
             </w:rPr>
           </w:pPr>
-          <w:hyperlink w:anchor="_Toc342233047" w:history="1">
+          <w:hyperlink w:anchor="_Toc342235086" w:history="1">
             <w:r>
               <w:rPr>
                 <w:rStyle w:val="Hyperlink"/>
                 <w:noProof/>
               </w:rPr>
-              <w:t>6.2</w:t>
+              <w:t>7.2</w:t>
             </w:r>
             <w:r>
               <w:rPr>
@@ -2569,7 +2569,87 @@
                 <w:noProof/>
                 <w:webHidden/>
               </w:rPr>
-              <w:instrText xml:space="preserve"> PAGEREF _Toc342233047 \h </w:instrText>
+              <w:instrText xml:space="preserve"> PAGEREF _Toc342235086 \h </w:instrText>
+            </w:r>
+            <w:r>
+              <w:rPr>
+                <w:noProof/>
+                <w:webHidden/>
+              </w:rPr>
+            </w:r>
+            <w:r>
+              <w:rPr>
+                <w:noProof/>
+                <w:webHidden/>
+              </w:rPr>
+              <w:fldChar w:fldCharType="separate"/>
+            </w:r>
+            <w:r>
+              <w:rPr>
+                <w:noProof/>
+                <w:webHidden/>
+              </w:rPr>
+              <w:t>13</w:t>
+            </w:r>
+            <w:r>
+              <w:rPr>
+                <w:noProof/>
+                <w:webHidden/>
+              </w:rPr>
+              <w:fldChar w:fldCharType="end"/>
+            </w:r>
+          </w:hyperlink>
+        </w:p>
+        <w:p>
+          <w:pPr>
+            <w:pStyle w:val="TOC1"/>
+            <w:rPr>
+              <w:rFonts w:eastAsiaTheme="minorEastAsia"/>
+              <w:noProof/>
+            </w:rPr>
+          </w:pPr>
+          <w:hyperlink w:anchor="_Toc342235087" w:history="1">
+            <w:r>
+              <w:rPr>
+                <w:rStyle w:val="Hyperlink"/>
+                <w:noProof/>
+              </w:rPr>
+              <w:t>8.</w:t>
+            </w:r>
+            <w:r>
+              <w:rPr>
+                <w:rFonts w:eastAsiaTheme="minorEastAsia"/>
+                <w:noProof/>
+              </w:rPr>
+              <w:tab/>
+            </w:r>
+            <w:r>
+              <w:rPr>
+                <w:rStyle w:val="Hyperlink"/>
+                <w:noProof/>
+              </w:rPr>
+              <w:t>Glossary</w:t>
+            </w:r>
+            <w:r>
+              <w:rPr>
+                <w:noProof/>
+                <w:webHidden/>
+              </w:rPr>
+              <w:tab/>
+            </w:r>
+            <w:r>
+              <w:rPr>
+                <w:noProof/>
+                <w:webHidden/>
+              </w:rPr>
+              <w:fldChar w:fldCharType="begin"/>
+            </w:r>
+            <w:r>
+              <w:rPr>
+                <w:noProof/>
+                <w:webHidden/>
+              </w:rPr>
+              <w:instrText xml:space="preserve"> PAGEREF _Toc342235087 \h </w:instrText>
             </w:r>
             <w:r>
               <w:rPr>
@@ -2628,7 +2708,7 @@
           <w:noProof/>
         </w:rPr>
       </w:pPr>
-      <w:bookmarkStart w:id="0" w:name="_Toc342233024"/>
+      <w:bookmarkStart w:id="0" w:name="_Toc342235066"/>
       <w:r>
         <w:t>Table of Figures</w:t>
       </w:r>
@@ -3196,9 +3276,8 @@
       <w:pPr>
         <w:pStyle w:val="Heading1"/>
       </w:pPr>
-      <w:bookmarkStart w:id="1" w:name="_Toc342233025"/>
-      <w:r>
-        <w:lastRenderedPageBreak/>
+      <w:bookmarkStart w:id="1" w:name="_Toc342235067"/>
+      <w:r>
         <w:t>Scope</w:t>
       </w:r>
       <w:bookmarkEnd w:id="1"/>
@@ -3242,7 +3321,7 @@
       <w:pPr>
         <w:pStyle w:val="Heading1"/>
       </w:pPr>
-      <w:bookmarkStart w:id="2" w:name="_Toc342233026"/>
+      <w:bookmarkStart w:id="2" w:name="_Toc342235068"/>
       <w:r>
         <w:t>Reference Documents</w:t>
       </w:r>
@@ -3268,15 +3347,7 @@
         <w:t>2.2</w:t>
       </w:r>
       <w:r>
-        <w:t xml:space="preserve"> </w:t>
-      </w:r>
-      <w:proofErr w:type="spellStart"/>
-      <w:r>
-        <w:t>CmdLink</w:t>
-      </w:r>
-      <w:proofErr w:type="spellEnd"/>
-      <w:r>
-        <w:t xml:space="preserve"> / Protocol Buffer Interface Documentation</w:t>
+        <w:t xml:space="preserve"> CmdLink / Protocol Buffer Interface Documentation</w:t>
       </w:r>
       <w:r>
         <w:br/>
@@ -3290,7 +3361,7 @@
       <w:pPr>
         <w:pStyle w:val="Heading1"/>
       </w:pPr>
-      <w:bookmarkStart w:id="7" w:name="_Toc342233027"/>
+      <w:bookmarkStart w:id="7" w:name="_Toc342235069"/>
       <w:r>
         <w:t>Current System</w:t>
       </w:r>
@@ -3341,18 +3412,8 @@
         <w:t>3.2.1</w:t>
       </w:r>
       <w:r>
-        <w:t xml:space="preserve"> One or more </w:t>
-      </w:r>
-      <w:proofErr w:type="spellStart"/>
-      <w:r>
-        <w:t>APM</w:t>
-      </w:r>
-      <w:bookmarkStart w:id="8" w:name="_GoBack"/>
-      <w:bookmarkEnd w:id="8"/>
-      <w:r>
-        <w:t>axes</w:t>
-      </w:r>
-      <w:proofErr w:type="spellEnd"/>
+        <w:t xml:space="preserve"> One or more APMaxes</w:t>
+      </w:r>
     </w:p>
     <w:p>
       <w:pPr>
@@ -3423,249 +3484,363 @@
       <w:pPr>
         <w:pStyle w:val="Heading1"/>
       </w:pPr>
-      <w:bookmarkStart w:id="9" w:name="_Toc342233028"/>
-      <w:r>
-        <w:t>Justification and nature of proposed changes</w:t>
-      </w:r>
-      <w:bookmarkStart w:id="10" w:name="_Toc342233029"/>
-      <w:bookmarkStart w:id="11" w:name="_Toc342233031"/>
-      <w:bookmarkStart w:id="12" w:name="_Toc342233032"/>
+      <w:bookmarkStart w:id="8" w:name="_Toc342235070"/>
+      <w:r>
+        <w:t>Justification and N</w:t>
+      </w:r>
+      <w:r>
+        <w:t xml:space="preserve">ature of </w:t>
+      </w:r>
+      <w:r>
+        <w:t>Proposed C</w:t>
+      </w:r>
+      <w:r>
+        <w:t>hanges</w:t>
+      </w:r>
+      <w:bookmarkStart w:id="9" w:name="_Toc342233029"/>
+      <w:bookmarkStart w:id="10" w:name="_Toc342233031"/>
+      <w:bookmarkEnd w:id="8"/>
       <w:bookmarkEnd w:id="9"/>
       <w:bookmarkEnd w:id="10"/>
+    </w:p>
+    <w:p>
+      <w:pPr>
+        <w:pStyle w:val="Heading2"/>
+      </w:pPr>
+      <w:bookmarkStart w:id="11" w:name="_Toc342235071"/>
+      <w:r>
+        <w:t>Justification for changes</w:t>
+      </w:r>
       <w:bookmarkEnd w:id="11"/>
     </w:p>
     <w:p>
+      <w:r>
+        <w:t>In the current set top box and APMax environment, STBs can only receive and respond to messages. Also, games are compiled into the firmware of each STB, which doesn’t allow games to be quickly added.</w:t>
+      </w:r>
+      <w:r>
+        <w:t xml:space="preserve"> There is also no concept of multiplayer games in the current environment.</w:t>
+      </w:r>
+    </w:p>
+    <w:p>
       <w:pPr>
         <w:pStyle w:val="Heading2"/>
       </w:pPr>
-      <w:r>
-        <w:t>Justification for changes</w:t>
+      <w:bookmarkStart w:id="12" w:name="_Toc342235072"/>
+      <w:r>
+        <w:lastRenderedPageBreak/>
+        <w:t>Description of desired change</w:t>
       </w:r>
       <w:bookmarkEnd w:id="12"/>
     </w:p>
     <w:p>
       <w:r>
-        <w:t>In the current set top box and APMax environment, STBs can only receive and respond to messages. Also, games are compiled into the firmware of each STB, which doesn’t allow games to be quickly added.</w:t>
-      </w:r>
-      <w:r>
-        <w:t xml:space="preserve"> There is also no concept of multiplayer games in the current environment.</w:t>
+        <w:t xml:space="preserve">The STB firmware will be updated to allow for games to be added via a network connection, so that the STB firmware will not have to be re-compiled every time a new game is developed. </w:t>
+      </w:r>
+      <w:r>
+        <w:t>The firmware update</w:t>
+      </w:r>
+      <w:r>
+        <w:t xml:space="preserve"> will also include a mechanism </w:t>
+      </w:r>
+      <w:r>
+        <w:t xml:space="preserve">that will allow STBs to </w:t>
+      </w:r>
+      <w:r>
+        <w:t xml:space="preserve">initiate communication </w:t>
+      </w:r>
+      <w:r>
+        <w:t>to external devices, such as our game server.</w:t>
+      </w:r>
+      <w:r>
+        <w:t xml:space="preserve"> A game server will be created in order to host game logic, communication between STBs, and artificial intelligence to simulate players.</w:t>
       </w:r>
     </w:p>
     <w:p>
       <w:pPr>
         <w:pStyle w:val="Heading2"/>
       </w:pPr>
-      <w:bookmarkStart w:id="13" w:name="_Toc342233033"/>
-      <w:r>
-        <w:t>Description of desired change</w:t>
+      <w:bookmarkStart w:id="13" w:name="_Toc342235073"/>
+      <w:r>
+        <w:t>Priority among changes</w:t>
       </w:r>
       <w:bookmarkEnd w:id="13"/>
     </w:p>
     <w:p>
       <w:r>
-        <w:t xml:space="preserve">The STB firmware will be updated to allow for games to be added via a network connection, so that the STB firmware will not have to be re-compiled every time a new game is developed. </w:t>
-      </w:r>
-      <w:r>
-        <w:t>The firmware update</w:t>
-      </w:r>
-      <w:r>
-        <w:t xml:space="preserve"> will also include a mechanism </w:t>
-      </w:r>
-      <w:r>
-        <w:t xml:space="preserve">that will allow STBs to </w:t>
-      </w:r>
-      <w:r>
-        <w:t xml:space="preserve">initiate communication </w:t>
-      </w:r>
-      <w:r>
-        <w:t xml:space="preserve">to external devices, such as </w:t>
-      </w:r>
+        <w:t xml:space="preserve">1) </w:t>
+      </w:r>
+      <w:r>
+        <w:t>T</w:t>
+      </w:r>
+      <w:r>
+        <w:t>he STB must be able to</w:t>
+      </w:r>
+      <w:r>
+        <w:t xml:space="preserve"> </w:t>
+      </w:r>
+      <w:r>
+        <w:t>receive ga</w:t>
+      </w:r>
+      <w:r>
+        <w:t>mes using a network connection</w:t>
+      </w:r>
+      <w:r>
+        <w:t>.</w:t>
+      </w:r>
+      <w:r>
+        <w:br/>
+      </w:r>
+      <w:r>
+        <w:t xml:space="preserve">2) </w:t>
+      </w:r>
+      <w:r>
+        <w:t>Game logic will be offloaded from the STB to the game server</w:t>
+      </w:r>
+      <w:r>
+        <w:t>.</w:t>
+      </w:r>
+      <w:r>
+        <w:br/>
+      </w:r>
+      <w:r>
+        <w:t xml:space="preserve">3) </w:t>
+      </w:r>
+      <w:r>
+        <w:t>Each game will share common components in order to give users a similar look and feel between games</w:t>
+      </w:r>
+      <w:r>
+        <w:t>.</w:t>
+      </w:r>
+    </w:p>
+    <w:p>
+      <w:pPr>
+        <w:pStyle w:val="Heading2"/>
+      </w:pPr>
+      <w:bookmarkStart w:id="14" w:name="_Toc342235074"/>
+      <w:r>
+        <w:t>Changes considered but not included</w:t>
+      </w:r>
+      <w:bookmarkEnd w:id="14"/>
+    </w:p>
+    <w:p>
+      <w:r>
+        <w:t>Due to time constraints, there are several ideas/features that will not be implemented during the lifetime of this p</w:t>
+      </w:r>
+      <w:r>
+        <w:t>hase.</w:t>
+      </w:r>
+      <w:r>
+        <w:t xml:space="preserve"> </w:t>
+      </w:r>
+      <w:r>
+        <w:t xml:space="preserve">Such features include user accounts, online services to manage user accounts, </w:t>
+      </w:r>
+      <w:r>
+        <w:t xml:space="preserve">and </w:t>
+      </w:r>
+      <w:r>
+        <w:t xml:space="preserve">card games. </w:t>
+      </w:r>
+    </w:p>
+    <w:p>
+      <w:pPr>
+        <w:pStyle w:val="Heading2"/>
+      </w:pPr>
+      <w:bookmarkStart w:id="15" w:name="_Toc342235075"/>
+      <w:r>
+        <w:t>Assumptions and constraints</w:t>
+      </w:r>
+      <w:bookmarkEnd w:id="15"/>
+    </w:p>
+    <w:p>
+      <w:r>
+        <w:t xml:space="preserve">Games that are currently implemented will be re-designed to allow for multiplayer support and to be hosted on the game server. </w:t>
+      </w:r>
+      <w:r>
+        <w:t xml:space="preserve">Given the limited time given for this phase, only one game will be implemented, which will be chess. This game will act as a proof of concept so that other games can be created later. </w:t>
+      </w:r>
+    </w:p>
+    <w:p>
+      <w:pPr>
+        <w:pStyle w:val="Heading1"/>
+      </w:pPr>
+      <w:bookmarkStart w:id="16" w:name="_Toc342235076"/>
+      <w:r>
+        <w:t>Deliverables</w:t>
+      </w:r>
+      <w:bookmarkEnd w:id="16"/>
+    </w:p>
+    <w:p>
+      <w:pPr>
+        <w:pStyle w:val="Heading2"/>
+      </w:pPr>
+      <w:bookmarkStart w:id="17" w:name="_Toc342235077"/>
+      <w:r>
+        <w:t>Software Requirements Document</w:t>
+      </w:r>
+      <w:bookmarkEnd w:id="17"/>
+    </w:p>
+    <w:p>
+      <w:pPr>
+        <w:pStyle w:val="Heading2"/>
+      </w:pPr>
+      <w:bookmarkStart w:id="18" w:name="_Toc342235078"/>
+      <w:r>
+        <w:t>Software Design Document</w:t>
+      </w:r>
+      <w:bookmarkEnd w:id="18"/>
+    </w:p>
+    <w:p>
+      <w:pPr>
+        <w:pStyle w:val="Heading2"/>
+      </w:pPr>
+      <w:bookmarkStart w:id="19" w:name="_Toc342235079"/>
+      <w:r>
+        <w:t>Release of server-side software</w:t>
+      </w:r>
+      <w:bookmarkEnd w:id="19"/>
+    </w:p>
+    <w:p>
+      <w:pPr>
+        <w:pStyle w:val="Heading2"/>
+      </w:pPr>
+      <w:bookmarkStart w:id="20" w:name="_Toc342235080"/>
+      <w:r>
+        <w:t>Chess</w:t>
+      </w:r>
+      <w:r>
+        <w:t xml:space="preserve"> games as a proof of concept</w:t>
+      </w:r>
+      <w:bookmarkEnd w:id="20"/>
+      <w:r>
+        <w:t xml:space="preserve"> </w:t>
+      </w:r>
+    </w:p>
+    <w:p>
+      <w:pPr>
+        <w:pStyle w:val="Heading2"/>
+      </w:pPr>
+      <w:bookmarkStart w:id="21" w:name="_Toc342235081"/>
+      <w:r>
+        <w:t>Virtual APMax code</w:t>
+      </w:r>
+      <w:bookmarkEnd w:id="21"/>
+    </w:p>
+    <w:p>
+      <w:pPr>
+        <w:pStyle w:val="Heading1"/>
+      </w:pPr>
+      <w:r>
+        <w:t xml:space="preserve">Concepts of the </w:t>
+      </w:r>
+      <w:r>
+        <w:t>P</w:t>
+      </w:r>
+      <w:r>
+        <w:t>rop</w:t>
+      </w:r>
+      <w:r>
+        <w:t>osed S</w:t>
+      </w:r>
+      <w:r>
+        <w:t>ystem</w:t>
+      </w:r>
+    </w:p>
+    <w:p>
+      <w:pPr>
+        <w:pStyle w:val="Heading2"/>
+      </w:pPr>
+      <w:r>
+        <w:t>Background, Objectives, and Scope</w:t>
+      </w:r>
+    </w:p>
+    <w:p>
+      <w:r>
+        <w:t>This project is a continuation of a previous senior design project that built games for the STB firmware.</w:t>
+      </w:r>
+      <w:r>
+        <w:t xml:space="preserve"> Our games will have multiplayer support that allows users to play against each other, if they are using </w:t>
+      </w:r>
+      <w:r>
+        <w:t>an Amino STB</w:t>
+      </w:r>
+      <w:r>
+        <w:t xml:space="preserve"> and are in an Innovative Systems supported telecommun</w:t>
+      </w:r>
+      <w:r>
+        <w:t>ication environment.</w:t>
+      </w:r>
+    </w:p>
+    <w:p>
+      <w:pPr>
+        <w:pStyle w:val="Heading2"/>
+      </w:pPr>
       <w:r>
         <w:lastRenderedPageBreak/>
-        <w:t>our game server.</w:t>
-      </w:r>
-      <w:r>
-        <w:t xml:space="preserve"> A game server will be created in order to host game logic, communication between STBs, and artificial intelligence to simulate players.</w:t>
+        <w:t>Operational Policies and Constraints</w:t>
+      </w:r>
+    </w:p>
+    <w:p>
+      <w:r>
+        <w:t>For the game server, the final product will be a service that runs on either a Windows Server OS</w:t>
+      </w:r>
+      <w:r>
+        <w:t xml:space="preserve"> or Azure, which is Microsoft’s cloud </w:t>
+      </w:r>
+      <w:r>
+        <w:t xml:space="preserve">server solution. </w:t>
+      </w:r>
+      <w:r>
+        <w:t>This service will be able to attach to a UI</w:t>
+      </w:r>
+      <w:r>
+        <w:t xml:space="preserve">, so that an administrator can easily add games, view error logs, </w:t>
+      </w:r>
+      <w:r>
+        <w:t>and, in</w:t>
+      </w:r>
+      <w:r>
+        <w:t xml:space="preserve"> general</w:t>
+      </w:r>
+      <w:r>
+        <w:t>,</w:t>
+      </w:r>
+      <w:r>
+        <w:t xml:space="preserve"> manage the service.</w:t>
+      </w:r>
+      <w:r>
+        <w:t xml:space="preserve"> The app that runs on the STBs must be able to run on the least powerful Amino STB, so that it will work for all STBs currently in use. This means that the game can use very little</w:t>
+      </w:r>
+      <w:r>
+        <w:t xml:space="preserve"> RAM</w:t>
+      </w:r>
+      <w:r>
+        <w:t xml:space="preserve"> (less than 1MB) </w:t>
+      </w:r>
+      <w:r>
+        <w:t>and can use no flash memory</w:t>
+      </w:r>
+      <w:r>
+        <w:t>. Therefore, all game information and instances of games must be stored on the server, and pushed down to the STBs.</w:t>
       </w:r>
     </w:p>
     <w:p>
       <w:pPr>
         <w:pStyle w:val="Heading2"/>
       </w:pPr>
-      <w:bookmarkStart w:id="14" w:name="_Toc342233034"/>
-      <w:r>
-        <w:t>Priority among changes</w:t>
-      </w:r>
-      <w:bookmarkEnd w:id="14"/>
-    </w:p>
-    <w:p>
-      <w:r>
-        <w:t xml:space="preserve">1) </w:t>
-      </w:r>
-      <w:r>
-        <w:t>T</w:t>
-      </w:r>
-      <w:r>
-        <w:t>he STB must be able to</w:t>
-      </w:r>
-      <w:r>
-        <w:t xml:space="preserve"> </w:t>
-      </w:r>
-      <w:r>
-        <w:t>receive ga</w:t>
-      </w:r>
-      <w:r>
-        <w:t>mes using a network connection</w:t>
-      </w:r>
-      <w:r>
-        <w:t>.</w:t>
-      </w:r>
-      <w:r>
-        <w:br/>
-      </w:r>
-      <w:r>
-        <w:t xml:space="preserve">2) </w:t>
-      </w:r>
-      <w:r>
-        <w:t>Game logic will be offloaded from the STB to the game server</w:t>
-      </w:r>
-      <w:r>
-        <w:t>.</w:t>
-      </w:r>
-      <w:r>
-        <w:br/>
-      </w:r>
-      <w:r>
-        <w:t xml:space="preserve">3) </w:t>
-      </w:r>
-      <w:r>
-        <w:t>Each game will share common components in order to give users a similar look and feel between games</w:t>
-      </w:r>
-      <w:r>
-        <w:t>.</w:t>
-      </w:r>
-    </w:p>
-    <w:p>
-      <w:pPr>
-        <w:pStyle w:val="Heading2"/>
-      </w:pPr>
-      <w:bookmarkStart w:id="15" w:name="_Toc342233035"/>
-      <w:r>
-        <w:t>Changes considered but not included</w:t>
-      </w:r>
-      <w:bookmarkEnd w:id="15"/>
-    </w:p>
-    <w:p>
-      <w:r>
-        <w:t>Due to time constraints, there are several ideas/features that will not be implemented during the lifetime of this p</w:t>
-      </w:r>
-      <w:r>
-        <w:t>hase.</w:t>
-      </w:r>
-      <w:r>
-        <w:t xml:space="preserve"> </w:t>
-      </w:r>
-      <w:r>
-        <w:t xml:space="preserve">Such features include user accounts, online services to manage user accounts, </w:t>
-      </w:r>
-      <w:r>
-        <w:t xml:space="preserve">and </w:t>
-      </w:r>
-      <w:r>
-        <w:t xml:space="preserve">card games. </w:t>
-      </w:r>
-    </w:p>
-    <w:p>
-      <w:pPr>
-        <w:pStyle w:val="Heading2"/>
-      </w:pPr>
-      <w:bookmarkStart w:id="16" w:name="_Toc342233036"/>
-      <w:r>
-        <w:t>Assumptions and constraints</w:t>
-      </w:r>
-      <w:bookmarkEnd w:id="16"/>
-    </w:p>
-    <w:p>
-      <w:r>
-        <w:t xml:space="preserve">Games that are currently implemented will be re-designed to allow for multiplayer support and to be hosted on the game server. </w:t>
-      </w:r>
-      <w:r>
-        <w:t xml:space="preserve">Given the limited time given for this phase, only one game will be implemented, which will be chess. This game will act as a proof of concept so that other games can be created later. </w:t>
-      </w:r>
-    </w:p>
-    <w:p/>
+      <w:r>
+        <w:t>Description of the Proposed System</w:t>
+      </w:r>
+    </w:p>
+    <w:p>
+      <w:bookmarkStart w:id="22" w:name="_GoBack"/>
+      <w:bookmarkEnd w:id="22"/>
+    </w:p>
     <w:p>
       <w:pPr>
         <w:pStyle w:val="Heading1"/>
       </w:pPr>
-      <w:bookmarkStart w:id="17" w:name="_Toc342233037"/>
-      <w:r>
-        <w:lastRenderedPageBreak/>
-        <w:t>Deliverables</w:t>
-      </w:r>
-      <w:bookmarkEnd w:id="17"/>
-    </w:p>
-    <w:p>
-      <w:pPr>
-        <w:pStyle w:val="Heading2"/>
-      </w:pPr>
-      <w:bookmarkStart w:id="18" w:name="_Toc342233038"/>
-      <w:r>
-        <w:t>Software Requirements Document</w:t>
-      </w:r>
-      <w:bookmarkEnd w:id="18"/>
-    </w:p>
-    <w:p>
-      <w:pPr>
-        <w:pStyle w:val="Heading2"/>
-      </w:pPr>
-      <w:bookmarkStart w:id="19" w:name="_Toc342233039"/>
-      <w:r>
-        <w:t>Software Design Document</w:t>
-      </w:r>
-      <w:bookmarkEnd w:id="19"/>
-    </w:p>
-    <w:p>
-      <w:pPr>
-        <w:pStyle w:val="Heading2"/>
-      </w:pPr>
-      <w:bookmarkStart w:id="20" w:name="_Toc342233040"/>
-      <w:r>
-        <w:t>Release of server-side software</w:t>
-      </w:r>
-      <w:bookmarkEnd w:id="20"/>
-    </w:p>
-    <w:p>
-      <w:pPr>
-        <w:pStyle w:val="Heading2"/>
-      </w:pPr>
-      <w:bookmarkStart w:id="21" w:name="_Toc342233041"/>
-      <w:r>
-        <w:t>Chess</w:t>
-      </w:r>
-      <w:r>
-        <w:t xml:space="preserve"> games as a proof of concept</w:t>
-      </w:r>
-      <w:bookmarkEnd w:id="21"/>
-      <w:r>
-        <w:t xml:space="preserve"> </w:t>
-      </w:r>
-    </w:p>
-    <w:p>
-      <w:pPr>
-        <w:pStyle w:val="Heading2"/>
-      </w:pPr>
-      <w:bookmarkStart w:id="22" w:name="_Toc342233042"/>
-      <w:r>
-        <w:t>Virtual APMax code</w:t>
-      </w:r>
-      <w:bookmarkEnd w:id="22"/>
-    </w:p>
-    <w:p>
-      <w:pPr>
-        <w:pStyle w:val="Heading1"/>
-      </w:pPr>
-      <w:bookmarkStart w:id="23" w:name="_Toc342233043"/>
+      <w:bookmarkStart w:id="23" w:name="_Toc342235082"/>
       <w:r>
         <w:t>Analysis of Proposed System</w:t>
       </w:r>
@@ -3689,7 +3864,7 @@
       <w:pPr>
         <w:pStyle w:val="Heading2"/>
       </w:pPr>
-      <w:bookmarkStart w:id="31" w:name="_Toc342233044"/>
+      <w:bookmarkStart w:id="31" w:name="_Toc342235083"/>
       <w:r>
         <w:t>Subscribers</w:t>
       </w:r>
@@ -3764,27 +3939,14 @@
       <w:r>
         <w:t xml:space="preserve">Figure </w:t>
       </w:r>
-      <w:r>
-        <w:fldChar w:fldCharType="begin"/>
-      </w:r>
-      <w:r>
-        <w:instrText xml:space="preserve"> SEQ Figure \* ARABIC </w:instrText>
-      </w:r>
-      <w:r>
-        <w:fldChar w:fldCharType="separate"/>
-      </w:r>
-      <w:r>
-        <w:rPr>
-          <w:noProof/>
-        </w:rPr>
-        <w:t>1</w:t>
-      </w:r>
-      <w:r>
-        <w:rPr>
-          <w:noProof/>
-        </w:rPr>
-        <w:fldChar w:fldCharType="end"/>
-      </w:r>
+      <w:fldSimple w:instr=" SEQ Figure \* ARABIC ">
+        <w:r>
+          <w:rPr>
+            <w:noProof/>
+          </w:rPr>
+          <w:t>1</w:t>
+        </w:r>
+      </w:fldSimple>
       <w:r>
         <w:t xml:space="preserve"> - Main Menu</w:t>
       </w:r>
@@ -3862,27 +4024,14 @@
       <w:r>
         <w:t xml:space="preserve">Figure </w:t>
       </w:r>
-      <w:r>
-        <w:fldChar w:fldCharType="begin"/>
-      </w:r>
-      <w:r>
-        <w:instrText xml:space="preserve"> SEQ Figure \* ARABIC </w:instrText>
-      </w:r>
-      <w:r>
-        <w:fldChar w:fldCharType="separate"/>
-      </w:r>
-      <w:r>
-        <w:rPr>
-          <w:noProof/>
-        </w:rPr>
-        <w:t>2</w:t>
-      </w:r>
-      <w:r>
-        <w:rPr>
-          <w:noProof/>
-        </w:rPr>
-        <w:fldChar w:fldCharType="end"/>
-      </w:r>
+      <w:fldSimple w:instr=" SEQ Figure \* ARABIC ">
+        <w:r>
+          <w:rPr>
+            <w:noProof/>
+          </w:rPr>
+          <w:t>2</w:t>
+        </w:r>
+      </w:fldSimple>
       <w:r>
         <w:t>- Apps submenu</w:t>
       </w:r>
@@ -3960,27 +4109,14 @@
       <w:r>
         <w:t xml:space="preserve">Figure </w:t>
       </w:r>
-      <w:r>
-        <w:fldChar w:fldCharType="begin"/>
-      </w:r>
-      <w:r>
-        <w:instrText xml:space="preserve"> SEQ Figure \* ARABIC </w:instrText>
-      </w:r>
-      <w:r>
-        <w:fldChar w:fldCharType="separate"/>
-      </w:r>
-      <w:r>
-        <w:rPr>
-          <w:noProof/>
-        </w:rPr>
-        <w:t>3</w:t>
-      </w:r>
-      <w:r>
-        <w:rPr>
-          <w:noProof/>
-        </w:rPr>
-        <w:fldChar w:fldCharType="end"/>
-      </w:r>
+      <w:fldSimple w:instr=" SEQ Figure \* ARABIC ">
+        <w:r>
+          <w:rPr>
+            <w:noProof/>
+          </w:rPr>
+          <w:t>3</w:t>
+        </w:r>
+      </w:fldSimple>
       <w:r>
         <w:t>- Games submenu</w:t>
       </w:r>
@@ -4061,27 +4197,14 @@
       <w:r>
         <w:t xml:space="preserve">Figure </w:t>
       </w:r>
-      <w:r>
-        <w:fldChar w:fldCharType="begin"/>
-      </w:r>
-      <w:r>
-        <w:instrText xml:space="preserve"> SEQ Figure \* ARABIC </w:instrText>
-      </w:r>
-      <w:r>
-        <w:fldChar w:fldCharType="separate"/>
-      </w:r>
-      <w:r>
-        <w:rPr>
-          <w:noProof/>
-        </w:rPr>
-        <w:t>4</w:t>
-      </w:r>
-      <w:r>
-        <w:rPr>
-          <w:noProof/>
-        </w:rPr>
-        <w:fldChar w:fldCharType="end"/>
-      </w:r>
+      <w:fldSimple w:instr=" SEQ Figure \* ARABIC ">
+        <w:r>
+          <w:rPr>
+            <w:noProof/>
+          </w:rPr>
+          <w:t>4</w:t>
+        </w:r>
+      </w:fldSimple>
       <w:r>
         <w:t xml:space="preserve"> - New Tile Puzzle Game</w:t>
       </w:r>
@@ -4159,27 +4282,14 @@
       <w:r>
         <w:t xml:space="preserve">Figure </w:t>
       </w:r>
-      <w:r>
-        <w:fldChar w:fldCharType="begin"/>
-      </w:r>
-      <w:r>
-        <w:instrText xml:space="preserve"> SEQ Figure \* ARABIC </w:instrText>
-      </w:r>
-      <w:r>
-        <w:fldChar w:fldCharType="separate"/>
-      </w:r>
-      <w:r>
-        <w:rPr>
-          <w:noProof/>
-        </w:rPr>
-        <w:t>5</w:t>
-      </w:r>
-      <w:r>
-        <w:rPr>
-          <w:noProof/>
-        </w:rPr>
-        <w:fldChar w:fldCharType="end"/>
-      </w:r>
+      <w:fldSimple w:instr=" SEQ Figure \* ARABIC ">
+        <w:r>
+          <w:rPr>
+            <w:noProof/>
+          </w:rPr>
+          <w:t>5</w:t>
+        </w:r>
+      </w:fldSimple>
       <w:r>
         <w:t xml:space="preserve"> - Settings Popover</w:t>
       </w:r>
@@ -4275,27 +4385,14 @@
       <w:r>
         <w:t xml:space="preserve">Figure </w:t>
       </w:r>
-      <w:r>
-        <w:fldChar w:fldCharType="begin"/>
-      </w:r>
-      <w:r>
-        <w:instrText xml:space="preserve"> SEQ Figure \* ARABIC </w:instrText>
-      </w:r>
-      <w:r>
-        <w:fldChar w:fldCharType="separate"/>
-      </w:r>
-      <w:r>
-        <w:rPr>
-          <w:noProof/>
-        </w:rPr>
-        <w:t>6</w:t>
-      </w:r>
-      <w:r>
-        <w:rPr>
-          <w:noProof/>
-        </w:rPr>
-        <w:fldChar w:fldCharType="end"/>
-      </w:r>
+      <w:fldSimple w:instr=" SEQ Figure \* ARABIC ">
+        <w:r>
+          <w:rPr>
+            <w:noProof/>
+          </w:rPr>
+          <w:t>6</w:t>
+        </w:r>
+      </w:fldSimple>
       <w:r>
         <w:t xml:space="preserve"> - Statistics Popover</w:t>
       </w:r>
@@ -4373,27 +4470,14 @@
       <w:r>
         <w:t xml:space="preserve">Figure </w:t>
       </w:r>
-      <w:r>
-        <w:fldChar w:fldCharType="begin"/>
-      </w:r>
-      <w:r>
-        <w:instrText xml:space="preserve"> SEQ Figure \* ARABIC </w:instrText>
-      </w:r>
-      <w:r>
-        <w:fldChar w:fldCharType="separate"/>
-      </w:r>
-      <w:r>
-        <w:rPr>
-          <w:noProof/>
-        </w:rPr>
-        <w:t>7</w:t>
-      </w:r>
-      <w:r>
-        <w:rPr>
-          <w:noProof/>
-        </w:rPr>
-        <w:fldChar w:fldCharType="end"/>
-      </w:r>
+      <w:fldSimple w:instr=" SEQ Figure \* ARABIC ">
+        <w:r>
+          <w:rPr>
+            <w:noProof/>
+          </w:rPr>
+          <w:t>7</w:t>
+        </w:r>
+      </w:fldSimple>
       <w:r>
         <w:t xml:space="preserve"> - Help Popover</w:t>
       </w:r>
@@ -4474,27 +4558,14 @@
       <w:r>
         <w:t xml:space="preserve">Figure </w:t>
       </w:r>
-      <w:r>
-        <w:fldChar w:fldCharType="begin"/>
-      </w:r>
-      <w:r>
-        <w:instrText xml:space="preserve"> SEQ Figure \* ARABIC </w:instrText>
-      </w:r>
-      <w:r>
-        <w:fldChar w:fldCharType="separate"/>
-      </w:r>
-      <w:r>
-        <w:rPr>
-          <w:noProof/>
-        </w:rPr>
-        <w:t>8</w:t>
-      </w:r>
-      <w:r>
-        <w:rPr>
-          <w:noProof/>
-        </w:rPr>
-        <w:fldChar w:fldCharType="end"/>
-      </w:r>
+      <w:fldSimple w:instr=" SEQ Figure \* ARABIC ">
+        <w:r>
+          <w:rPr>
+            <w:noProof/>
+          </w:rPr>
+          <w:t>8</w:t>
+        </w:r>
+      </w:fldSimple>
       <w:r>
         <w:t xml:space="preserve"> – Gameplay</w:t>
       </w:r>
@@ -4515,7 +4586,7 @@
       <w:pPr>
         <w:pStyle w:val="Heading1"/>
       </w:pPr>
-      <w:bookmarkStart w:id="40" w:name="_Toc342233045"/>
+      <w:bookmarkStart w:id="40" w:name="_Toc342235084"/>
       <w:r>
         <w:t>Summary of Impacts</w:t>
       </w:r>
@@ -4529,7 +4600,7 @@
       <w:pPr>
         <w:pStyle w:val="Heading2"/>
       </w:pPr>
-      <w:bookmarkStart w:id="43" w:name="_Toc342233046"/>
+      <w:bookmarkStart w:id="43" w:name="_Toc342235085"/>
       <w:r>
         <w:t>Client</w:t>
       </w:r>
@@ -4562,7 +4633,7 @@
       <w:pPr>
         <w:pStyle w:val="Heading2"/>
       </w:pPr>
-      <w:bookmarkStart w:id="44" w:name="_Toc342233047"/>
+      <w:bookmarkStart w:id="44" w:name="_Toc342235086"/>
       <w:r>
         <w:lastRenderedPageBreak/>
         <w:t>Subscriber</w:t>
@@ -4587,9 +4658,101 @@
       <w:pPr>
         <w:pStyle w:val="Heading1"/>
       </w:pPr>
+      <w:bookmarkStart w:id="45" w:name="_Toc342235087"/>
+      <w:r>
+        <w:t>Glossary</w:t>
+      </w:r>
+      <w:bookmarkEnd w:id="45"/>
+    </w:p>
+    <w:p>
+      <w:r>
+        <w:t>STB – Set Top Box</w:t>
+      </w:r>
+      <w:r>
+        <w:br/>
+      </w:r>
+      <w:r>
+        <w:t>CmdLink – Command Link</w:t>
+      </w:r>
+      <w:r>
+        <w:br/>
+      </w:r>
+      <w:r>
+        <w:t>IPTV – Internet Protocol Television</w:t>
+      </w:r>
+      <w:r>
+        <w:br/>
+        <w:t>Telco – Telecommunications Company</w:t>
+      </w:r>
+      <w:r>
+        <w:br/>
+      </w:r>
+      <w:hyperlink r:id="rId18" w:history="1">
+        <w:r>
+          <w:rPr>
+            <w:rStyle w:val="Hyperlink"/>
+          </w:rPr>
+          <w:t>APMax</w:t>
+        </w:r>
+      </w:hyperlink>
+      <w:r>
+        <w:t xml:space="preserve"> </w:t>
+      </w:r>
+      <w:r>
+        <w:t>–</w:t>
+      </w:r>
+      <w:r>
+        <w:t xml:space="preserve"> </w:t>
+      </w:r>
+      <w:r>
+        <w:t>Innovative System’s proprietary</w:t>
+      </w:r>
+      <w:r>
+        <w:t xml:space="preserve"> middleware solution for </w:t>
+      </w:r>
+      <w:r>
+        <w:t>Telco’s</w:t>
+      </w:r>
+      <w:r>
+        <w:br/>
+      </w:r>
+      <w:r>
+        <w:t>A</w:t>
+      </w:r>
+      <w:r>
+        <w:t>pp –</w:t>
+      </w:r>
+      <w:r>
+        <w:t xml:space="preserve"> Application</w:t>
+      </w:r>
+      <w:r>
+        <w:br/>
+      </w:r>
+      <w:r>
+        <w:t>STBMF – Set Top Box Multiplayer</w:t>
+      </w:r>
+      <w:r>
+        <w:t xml:space="preserve"> Framework</w:t>
+      </w:r>
+      <w:r>
+        <w:br/>
+        <w:t>OS – Operating System</w:t>
+      </w:r>
+      <w:r>
+        <w:br/>
+        <w:t>UI – User Interface</w:t>
+      </w:r>
+      <w:r>
+        <w:br/>
+        <w:t>MB – Mega Byte</w:t>
+      </w:r>
+      <w:r>
+        <w:br/>
+        <w:t>RAM – Random Access Memory</w:t>
+      </w:r>
     </w:p>
     <w:sectPr>
-      <w:headerReference w:type="default" r:id="rId18"/>
+      <w:headerReference w:type="default" r:id="rId19"/>
       <w:pgSz w:w="12240" w:h="15840"/>
       <w:pgMar w:top="1440" w:right="1440" w:bottom="1440" w:left="1440" w:header="720" w:footer="720" w:gutter="0"/>
       <w:cols w:space="720"/>
@@ -4683,7 +4846,7 @@
           <w:rPr>
             <w:noProof/>
           </w:rPr>
-          <w:t>3</w:t>
+          <w:t>5</w:t>
         </w:r>
         <w:r>
           <w:rPr>
@@ -6067,6 +6230,7 @@
   <w:style w:type="character" w:default="1" w:styleId="DefaultParagraphFont">
     <w:name w:val="Default Paragraph Font"/>
     <w:uiPriority w:val="1"/>
+    <w:semiHidden/>
     <w:unhideWhenUsed/>
   </w:style>
   <w:style w:type="table" w:default="1" w:styleId="TableNormal">
@@ -6916,6 +7080,7 @@
   <w:style w:type="character" w:default="1" w:styleId="DefaultParagraphFont">
     <w:name w:val="Default Paragraph Font"/>
     <w:uiPriority w:val="1"/>
+    <w:semiHidden/>
     <w:unhideWhenUsed/>
   </w:style>
   <w:style w:type="table" w:default="1" w:styleId="TableNormal">
@@ -7648,7 +7813,7 @@
 </file>
 
 <file path=customXml/itemProps1.xml><?xml version="1.0" encoding="utf-8"?>
-<ds:datastoreItem xmlns:ds="http://schemas.openxmlformats.org/officeDocument/2006/customXml" ds:itemID="{465CE433-3EE6-4AE0-BD4E-A16537715C79}">
+<ds:datastoreItem xmlns:ds="http://schemas.openxmlformats.org/officeDocument/2006/customXml" ds:itemID="{B4934ABE-B5E9-43DC-B2EA-D1A820F03C91}">
   <ds:schemaRefs>
     <ds:schemaRef ds:uri="http://schemas.openxmlformats.org/officeDocument/2006/bibliography"/>
   </ds:schemaRefs>

</xml_diff>

<commit_message>
Updated CONOPS with Concepts of Proposed System
</commit_message>
<xml_diff>
--- a/docs/srDesign_CONOPS.docx
+++ b/docs/srDesign_CONOPS.docx
@@ -3347,7 +3347,15 @@
         <w:t>2.2</w:t>
       </w:r>
       <w:r>
-        <w:t xml:space="preserve"> CmdLink / Protocol Buffer Interface Documentation</w:t>
+        <w:t xml:space="preserve"> </w:t>
+      </w:r>
+      <w:proofErr w:type="spellStart"/>
+      <w:r>
+        <w:t>CmdLink</w:t>
+      </w:r>
+      <w:proofErr w:type="spellEnd"/>
+      <w:r>
+        <w:t xml:space="preserve"> / Protocol Buffer Interface Documentation</w:t>
       </w:r>
       <w:r>
         <w:br/>
@@ -3833,8 +3841,23 @@
       </w:r>
     </w:p>
     <w:p>
+      <w:r>
+        <w:t>A multi-player game environment that takes the existing APMax and STB model and adds a server that connects</w:t>
+      </w:r>
+      <w:r>
+        <w:t xml:space="preserve"> </w:t>
+      </w:r>
+      <w:r>
+        <w:t>APMaxes</w:t>
+      </w:r>
+      <w:r>
+        <w:t>, so that subscrib</w:t>
+      </w:r>
       <w:bookmarkStart w:id="22" w:name="_GoBack"/>
       <w:bookmarkEnd w:id="22"/>
+      <w:r>
+        <w:t>ers in different service areas can play games against each other.</w:t>
+      </w:r>
     </w:p>
     <w:p>
       <w:pPr>
@@ -3939,14 +3962,27 @@
       <w:r>
         <w:t xml:space="preserve">Figure </w:t>
       </w:r>
-      <w:fldSimple w:instr=" SEQ Figure \* ARABIC ">
-        <w:r>
-          <w:rPr>
-            <w:noProof/>
-          </w:rPr>
-          <w:t>1</w:t>
-        </w:r>
-      </w:fldSimple>
+      <w:r>
+        <w:fldChar w:fldCharType="begin"/>
+      </w:r>
+      <w:r>
+        <w:instrText xml:space="preserve"> SEQ Figure \* ARABIC </w:instrText>
+      </w:r>
+      <w:r>
+        <w:fldChar w:fldCharType="separate"/>
+      </w:r>
+      <w:r>
+        <w:rPr>
+          <w:noProof/>
+        </w:rPr>
+        <w:t>1</w:t>
+      </w:r>
+      <w:r>
+        <w:rPr>
+          <w:noProof/>
+        </w:rPr>
+        <w:fldChar w:fldCharType="end"/>
+      </w:r>
       <w:r>
         <w:t xml:space="preserve"> - Main Menu</w:t>
       </w:r>
@@ -4024,14 +4060,27 @@
       <w:r>
         <w:t xml:space="preserve">Figure </w:t>
       </w:r>
-      <w:fldSimple w:instr=" SEQ Figure \* ARABIC ">
-        <w:r>
-          <w:rPr>
-            <w:noProof/>
-          </w:rPr>
-          <w:t>2</w:t>
-        </w:r>
-      </w:fldSimple>
+      <w:r>
+        <w:fldChar w:fldCharType="begin"/>
+      </w:r>
+      <w:r>
+        <w:instrText xml:space="preserve"> SEQ Figure \* ARABIC </w:instrText>
+      </w:r>
+      <w:r>
+        <w:fldChar w:fldCharType="separate"/>
+      </w:r>
+      <w:r>
+        <w:rPr>
+          <w:noProof/>
+        </w:rPr>
+        <w:t>2</w:t>
+      </w:r>
+      <w:r>
+        <w:rPr>
+          <w:noProof/>
+        </w:rPr>
+        <w:fldChar w:fldCharType="end"/>
+      </w:r>
       <w:r>
         <w:t>- Apps submenu</w:t>
       </w:r>
@@ -4109,14 +4158,27 @@
       <w:r>
         <w:t xml:space="preserve">Figure </w:t>
       </w:r>
-      <w:fldSimple w:instr=" SEQ Figure \* ARABIC ">
-        <w:r>
-          <w:rPr>
-            <w:noProof/>
-          </w:rPr>
-          <w:t>3</w:t>
-        </w:r>
-      </w:fldSimple>
+      <w:r>
+        <w:fldChar w:fldCharType="begin"/>
+      </w:r>
+      <w:r>
+        <w:instrText xml:space="preserve"> SEQ Figure \* ARABIC </w:instrText>
+      </w:r>
+      <w:r>
+        <w:fldChar w:fldCharType="separate"/>
+      </w:r>
+      <w:r>
+        <w:rPr>
+          <w:noProof/>
+        </w:rPr>
+        <w:t>3</w:t>
+      </w:r>
+      <w:r>
+        <w:rPr>
+          <w:noProof/>
+        </w:rPr>
+        <w:fldChar w:fldCharType="end"/>
+      </w:r>
       <w:r>
         <w:t>- Games submenu</w:t>
       </w:r>
@@ -4197,14 +4259,27 @@
       <w:r>
         <w:t xml:space="preserve">Figure </w:t>
       </w:r>
-      <w:fldSimple w:instr=" SEQ Figure \* ARABIC ">
-        <w:r>
-          <w:rPr>
-            <w:noProof/>
-          </w:rPr>
-          <w:t>4</w:t>
-        </w:r>
-      </w:fldSimple>
+      <w:r>
+        <w:fldChar w:fldCharType="begin"/>
+      </w:r>
+      <w:r>
+        <w:instrText xml:space="preserve"> SEQ Figure \* ARABIC </w:instrText>
+      </w:r>
+      <w:r>
+        <w:fldChar w:fldCharType="separate"/>
+      </w:r>
+      <w:r>
+        <w:rPr>
+          <w:noProof/>
+        </w:rPr>
+        <w:t>4</w:t>
+      </w:r>
+      <w:r>
+        <w:rPr>
+          <w:noProof/>
+        </w:rPr>
+        <w:fldChar w:fldCharType="end"/>
+      </w:r>
       <w:r>
         <w:t xml:space="preserve"> - New Tile Puzzle Game</w:t>
       </w:r>
@@ -4282,14 +4357,27 @@
       <w:r>
         <w:t xml:space="preserve">Figure </w:t>
       </w:r>
-      <w:fldSimple w:instr=" SEQ Figure \* ARABIC ">
-        <w:r>
-          <w:rPr>
-            <w:noProof/>
-          </w:rPr>
-          <w:t>5</w:t>
-        </w:r>
-      </w:fldSimple>
+      <w:r>
+        <w:fldChar w:fldCharType="begin"/>
+      </w:r>
+      <w:r>
+        <w:instrText xml:space="preserve"> SEQ Figure \* ARABIC </w:instrText>
+      </w:r>
+      <w:r>
+        <w:fldChar w:fldCharType="separate"/>
+      </w:r>
+      <w:r>
+        <w:rPr>
+          <w:noProof/>
+        </w:rPr>
+        <w:t>5</w:t>
+      </w:r>
+      <w:r>
+        <w:rPr>
+          <w:noProof/>
+        </w:rPr>
+        <w:fldChar w:fldCharType="end"/>
+      </w:r>
       <w:r>
         <w:t xml:space="preserve"> - Settings Popover</w:t>
       </w:r>
@@ -4385,14 +4473,27 @@
       <w:r>
         <w:t xml:space="preserve">Figure </w:t>
       </w:r>
-      <w:fldSimple w:instr=" SEQ Figure \* ARABIC ">
-        <w:r>
-          <w:rPr>
-            <w:noProof/>
-          </w:rPr>
-          <w:t>6</w:t>
-        </w:r>
-      </w:fldSimple>
+      <w:r>
+        <w:fldChar w:fldCharType="begin"/>
+      </w:r>
+      <w:r>
+        <w:instrText xml:space="preserve"> SEQ Figure \* ARABIC </w:instrText>
+      </w:r>
+      <w:r>
+        <w:fldChar w:fldCharType="separate"/>
+      </w:r>
+      <w:r>
+        <w:rPr>
+          <w:noProof/>
+        </w:rPr>
+        <w:t>6</w:t>
+      </w:r>
+      <w:r>
+        <w:rPr>
+          <w:noProof/>
+        </w:rPr>
+        <w:fldChar w:fldCharType="end"/>
+      </w:r>
       <w:r>
         <w:t xml:space="preserve"> - Statistics Popover</w:t>
       </w:r>
@@ -4470,14 +4571,27 @@
       <w:r>
         <w:t xml:space="preserve">Figure </w:t>
       </w:r>
-      <w:fldSimple w:instr=" SEQ Figure \* ARABIC ">
-        <w:r>
-          <w:rPr>
-            <w:noProof/>
-          </w:rPr>
-          <w:t>7</w:t>
-        </w:r>
-      </w:fldSimple>
+      <w:r>
+        <w:fldChar w:fldCharType="begin"/>
+      </w:r>
+      <w:r>
+        <w:instrText xml:space="preserve"> SEQ Figure \* ARABIC </w:instrText>
+      </w:r>
+      <w:r>
+        <w:fldChar w:fldCharType="separate"/>
+      </w:r>
+      <w:r>
+        <w:rPr>
+          <w:noProof/>
+        </w:rPr>
+        <w:t>7</w:t>
+      </w:r>
+      <w:r>
+        <w:rPr>
+          <w:noProof/>
+        </w:rPr>
+        <w:fldChar w:fldCharType="end"/>
+      </w:r>
       <w:r>
         <w:t xml:space="preserve"> - Help Popover</w:t>
       </w:r>
@@ -4558,14 +4672,27 @@
       <w:r>
         <w:t xml:space="preserve">Figure </w:t>
       </w:r>
-      <w:fldSimple w:instr=" SEQ Figure \* ARABIC ">
-        <w:r>
-          <w:rPr>
-            <w:noProof/>
-          </w:rPr>
-          <w:t>8</w:t>
-        </w:r>
-      </w:fldSimple>
+      <w:r>
+        <w:fldChar w:fldCharType="begin"/>
+      </w:r>
+      <w:r>
+        <w:instrText xml:space="preserve"> SEQ Figure \* ARABIC </w:instrText>
+      </w:r>
+      <w:r>
+        <w:fldChar w:fldCharType="separate"/>
+      </w:r>
+      <w:r>
+        <w:rPr>
+          <w:noProof/>
+        </w:rPr>
+        <w:t>8</w:t>
+      </w:r>
+      <w:r>
+        <w:rPr>
+          <w:noProof/>
+        </w:rPr>
+        <w:fldChar w:fldCharType="end"/>
+      </w:r>
       <w:r>
         <w:t xml:space="preserve"> – Gameplay</w:t>
       </w:r>
@@ -4671,8 +4798,13 @@
       <w:r>
         <w:br/>
       </w:r>
-      <w:r>
-        <w:t>CmdLink – Command Link</w:t>
+      <w:proofErr w:type="spellStart"/>
+      <w:r>
+        <w:t>CmdLink</w:t>
+      </w:r>
+      <w:proofErr w:type="spellEnd"/>
+      <w:r>
+        <w:t xml:space="preserve"> – Command Link</w:t>
       </w:r>
       <w:r>
         <w:br/>
@@ -7813,7 +7945,7 @@
 </file>
 
 <file path=customXml/itemProps1.xml><?xml version="1.0" encoding="utf-8"?>
-<ds:datastoreItem xmlns:ds="http://schemas.openxmlformats.org/officeDocument/2006/customXml" ds:itemID="{B4934ABE-B5E9-43DC-B2EA-D1A820F03C91}">
+<ds:datastoreItem xmlns:ds="http://schemas.openxmlformats.org/officeDocument/2006/customXml" ds:itemID="{5B1129D8-4FA0-41E6-8980-A61EC0C5846B}">
   <ds:schemaRefs>
     <ds:schemaRef ds:uri="http://schemas.openxmlformats.org/officeDocument/2006/bibliography"/>
   </ds:schemaRefs>

</xml_diff>